<commit_message>
updating the initial script running process
Updating the initial instructions for downloading and running of the initial scripts to conform to the new GitHub location of the PowerShell files.
</commit_message>
<xml_diff>
--- a/PowerShellScriptsAdam/Adams_PowerShell_Scrpt_Instructions.docx
+++ b/PowerShellScriptsAdam/Adams_PowerShell_Scrpt_Instructions.docx
@@ -78,14 +78,7 @@
           <w:sz w:val="36"/>
           <w:szCs w:val="36"/>
         </w:rPr>
-        <w:t xml:space="preserve">Originally Written </w:t>
-      </w:r>
-      <w:r>
-        <w:rPr>
-          <w:sz w:val="36"/>
-          <w:szCs w:val="36"/>
-        </w:rPr>
-        <w:t>December 2025 by Adam and Brayden</w:t>
+        <w:t>Originally Written December 2025 by Adam and Brayden</w:t>
       </w:r>
     </w:p>
     <w:p>
@@ -209,7 +202,7 @@
         <w:pStyle w:val="Heading1"/>
         <w:numPr>
           <w:ilvl w:val="0"/>
-          <w:numId w:val="1"/>
+          <w:numId w:val="2"/>
         </w:numPr>
         <w:ind w:hanging="0" w:left="0"/>
         <w:rPr/>
@@ -237,81 +230,11 @@
       <w:pPr>
         <w:pStyle w:val="Heading2"/>
         <w:numPr>
-          <w:ilvl w:val="1"/>
-          <w:numId w:val="3"/>
+          <w:ilvl w:val="0"/>
+          <w:numId w:val="0"/>
         </w:numPr>
         <w:bidi w:val="0"/>
         <w:ind w:hanging="0" w:left="0"/>
-        <w:jc w:val="left"/>
-        <w:rPr/>
-      </w:pPr>
-      <w:r>
-        <w:rPr/>
-      </w:r>
-    </w:p>
-    <w:p>
-      <w:pPr>
-        <w:pStyle w:val="Heading2"/>
-        <w:numPr>
-          <w:ilvl w:val="1"/>
-          <w:numId w:val="3"/>
-        </w:numPr>
-        <w:bidi w:val="0"/>
-        <w:ind w:hanging="0" w:left="0"/>
-        <w:jc w:val="left"/>
-        <w:rPr/>
-      </w:pPr>
-      <w:r>
-        <w:rPr/>
-        <w:t>Initial File Copy Script.cmd</w:t>
-      </w:r>
-    </w:p>
-    <w:p>
-      <w:pPr>
-        <w:pStyle w:val="BodyText"/>
-        <w:bidi w:val="0"/>
-        <w:ind w:hanging="0" w:left="0"/>
-        <w:jc w:val="left"/>
-        <w:rPr/>
-      </w:pPr>
-      <w:r>
-        <w:rPr/>
-        <w:t xml:space="preserve">The purpose of this script is to create a folder on the computer to be refurbished and then copy all necessary files onto the computer in order to to prepare the computer to run the initialization scripts.  Run this script first, after the refurbished computer has had a fresh OS installed. </w:t>
-      </w:r>
-    </w:p>
-    <w:p>
-      <w:pPr>
-        <w:pStyle w:val="Heading2"/>
-        <w:numPr>
-          <w:ilvl w:val="1"/>
-          <w:numId w:val="3"/>
-        </w:numPr>
-        <w:bidi w:val="0"/>
-        <w:ind w:hanging="0" w:left="0"/>
-        <w:jc w:val="left"/>
-        <w:rPr/>
-      </w:pPr>
-      <w:r>
-        <w:rPr/>
-        <w:t>Initialize Script.ps1</w:t>
-      </w:r>
-    </w:p>
-    <w:p>
-      <w:pPr>
-        <w:pStyle w:val="Normal"/>
-        <w:bidi w:val="0"/>
-        <w:jc w:val="left"/>
-        <w:rPr/>
-      </w:pPr>
-      <w:r>
-        <w:rPr/>
-        <w:t>This script should be used on a computer that has just had its operating system installed fresh.  The purpose of this script is to perform a bunch of one-time preparation tasks.  The script will then install a series of applications, and will place shortcuts to those applications in folders on the user’s desktop.</w:t>
-      </w:r>
-    </w:p>
-    <w:p>
-      <w:pPr>
-        <w:pStyle w:val="Normal"/>
-        <w:bidi w:val="0"/>
         <w:jc w:val="left"/>
         <w:rPr/>
       </w:pPr>
@@ -326,7 +249,7 @@
         <w:widowControl/>
         <w:numPr>
           <w:ilvl w:val="1"/>
-          <w:numId w:val="3"/>
+          <w:numId w:val="4"/>
         </w:numPr>
         <w:suppressAutoHyphens w:val="true"/>
         <w:bidi w:val="0"/>
@@ -358,18 +281,80 @@
       </w:pPr>
       <w:r>
         <w:rPr/>
-        <w:t>The purpose of this command prompt script is to launch the Initialize Script.ps1 script in a PowerShell window with the proper administrative credentials needed to run unsigned PowerShell scripts in Windows.  When launched, it will prompt the user to click OK to elevate privileges, which is done on purpose, by design.  Otherwise, a fresh copy of Windows will not allow a new user to run unsigned PowerShell scripts by policy.</w:t>
-      </w:r>
-    </w:p>
-    <w:p>
-      <w:pPr>
-        <w:pStyle w:val="Normal"/>
-        <w:bidi w:val="0"/>
-        <w:jc w:val="left"/>
-        <w:rPr/>
-      </w:pPr>
-      <w:r>
-        <w:rPr/>
+        <w:t xml:space="preserve">The purpose of this command prompt script is to launch the Initialize Script.ps1 script in a PowerShell window with the proper administrative credentials needed to run unsigned PowerShell scripts in Windows.  When launched, it will prompt the user to click OK to elevate privileges, which is done on purpose, by design.  Otherwise, a fresh copy of Windows will not allow a new user to run unsigned PowerShell scripts by policy.  </w:t>
+      </w:r>
+      <w:r>
+        <w:rPr/>
+        <w:t xml:space="preserve">This script also copies the necessary files over to the </w:t>
+      </w:r>
+      <w:r>
+        <w:rPr>
+          <w:b w:val="false"/>
+          <w:bCs w:val="false"/>
+        </w:rPr>
+        <w:t>C:\</w:t>
+      </w:r>
+      <w:hyperlink r:id="rId2">
+        <w:r>
+          <w:rPr>
+            <w:rStyle w:val="Hyperlink"/>
+            <w:b w:val="false"/>
+            <w:bCs w:val="false"/>
+          </w:rPr>
+          <w:t>KindworksScripts</w:t>
+        </w:r>
+      </w:hyperlink>
+      <w:r>
+        <w:rPr>
+          <w:b w:val="false"/>
+          <w:bCs w:val="false"/>
+        </w:rPr>
+        <w:t xml:space="preserve"> folder in order to facilitate future use.</w:t>
+      </w:r>
+    </w:p>
+    <w:p>
+      <w:pPr>
+        <w:pStyle w:val="Heading2"/>
+        <w:numPr>
+          <w:ilvl w:val="1"/>
+          <w:numId w:val="4"/>
+        </w:numPr>
+        <w:bidi w:val="0"/>
+        <w:ind w:hanging="0" w:left="0"/>
+        <w:jc w:val="left"/>
+        <w:rPr/>
+      </w:pPr>
+      <w:r>
+        <w:rPr/>
+      </w:r>
+    </w:p>
+    <w:p>
+      <w:pPr>
+        <w:pStyle w:val="Heading2"/>
+        <w:numPr>
+          <w:ilvl w:val="1"/>
+          <w:numId w:val="4"/>
+        </w:numPr>
+        <w:bidi w:val="0"/>
+        <w:ind w:hanging="0" w:left="0"/>
+        <w:jc w:val="left"/>
+        <w:rPr/>
+      </w:pPr>
+      <w:r>
+        <w:rPr/>
+        <w:t>Initialize Script.ps1</w:t>
+      </w:r>
+    </w:p>
+    <w:p>
+      <w:pPr>
+        <w:pStyle w:val="Normal"/>
+        <w:bidi w:val="0"/>
+        <w:jc w:val="left"/>
+        <w:rPr/>
+      </w:pPr>
+      <w:r>
+        <w:rPr/>
+        <w:t>This script should be used on a computer that has just had its operating system installed fresh.  The purpose of this script is to perform a bunch of one-time preparation tasks.  The script will then install a series of applications, and will place shortcuts to those applications in folders on the user’s desktop.</w:t>
       </w:r>
     </w:p>
     <w:p>
@@ -390,7 +375,7 @@
         <w:widowControl/>
         <w:numPr>
           <w:ilvl w:val="1"/>
-          <w:numId w:val="3"/>
+          <w:numId w:val="4"/>
         </w:numPr>
         <w:suppressAutoHyphens w:val="true"/>
         <w:bidi w:val="0"/>
@@ -410,40 +395,28 @@
           <w:kern w:val="2"/>
           <w:lang w:val="en-US" w:eastAsia="zh-CN" w:bidi="hi-IN"/>
         </w:rPr>
-        <w:t>Update Apps.ps1</w:t>
-      </w:r>
-    </w:p>
-    <w:p>
-      <w:pPr>
-        <w:pStyle w:val="Normal"/>
-        <w:bidi w:val="0"/>
-        <w:jc w:val="left"/>
-        <w:rPr/>
-      </w:pPr>
-      <w:r>
-        <w:rPr/>
-        <w:t>The purpose of this script is to update all of the applications that KindWorks installed on the refurbished computer.  The value of this script is that, once launched, it updates multiple applications, saving the user significant time.  This relies on the Chocolately application to update the applications.</w:t>
-      </w:r>
-    </w:p>
-    <w:p>
-      <w:pPr>
-        <w:pStyle w:val="Normal"/>
-        <w:bidi w:val="0"/>
-        <w:jc w:val="left"/>
-        <w:rPr/>
-      </w:pPr>
-      <w:r>
-        <w:rPr/>
-      </w:r>
-    </w:p>
-    <w:p>
-      <w:pPr>
-        <w:pStyle w:val="Heading2"/>
-        <w:keepNext w:val="true"/>
+        <w:t>Update Apps.cmd</w:t>
+      </w:r>
+    </w:p>
+    <w:p>
+      <w:pPr>
+        <w:pStyle w:val="Normal"/>
+        <w:bidi w:val="0"/>
+        <w:jc w:val="left"/>
+        <w:rPr/>
+      </w:pPr>
+      <w:r>
+        <w:rPr/>
+        <w:t>The purpose of this command prompt script is to launch the Update Apps.ps1 script in a PowerShell window with the proper administrative credentials needed to run unsigned PowerShell scripts in Windows.  When launched, it will prompt the user to click OK to elevate privileges, which is done on purpose, by design.  Otherwise, a fresh copy of Windows will not allow a new user to run unsigned PowerShell scripts by policy.</w:t>
+      </w:r>
+    </w:p>
+    <w:p>
+      <w:pPr>
+        <w:pStyle w:val="BodyText"/>
         <w:widowControl/>
         <w:numPr>
-          <w:ilvl w:val="1"/>
-          <w:numId w:val="3"/>
+          <w:ilvl w:val="0"/>
+          <w:numId w:val="0"/>
         </w:numPr>
         <w:suppressAutoHyphens w:val="true"/>
         <w:bidi w:val="0"/>
@@ -457,25 +430,49 @@
         </w:rPr>
       </w:pPr>
       <w:r>
+        <w:rPr/>
+      </w:r>
+    </w:p>
+    <w:p>
+      <w:pPr>
+        <w:pStyle w:val="Heading2"/>
+        <w:keepNext w:val="true"/>
+        <w:widowControl/>
+        <w:numPr>
+          <w:ilvl w:val="1"/>
+          <w:numId w:val="4"/>
+        </w:numPr>
+        <w:suppressAutoHyphens w:val="true"/>
+        <w:bidi w:val="0"/>
+        <w:ind w:hanging="0" w:left="0"/>
+        <w:jc w:val="left"/>
+        <w:rPr>
+          <w:rFonts w:ascii="Liberation Sans" w:hAnsi="Liberation Sans" w:eastAsia="Microsoft YaHei" w:cs="Arial"/>
+          <w:color w:val="auto"/>
+          <w:kern w:val="2"/>
+          <w:lang w:val="en-US" w:eastAsia="zh-CN" w:bidi="hi-IN"/>
+        </w:rPr>
+      </w:pPr>
+      <w:r>
         <w:rPr>
           <w:rFonts w:eastAsia="Microsoft YaHei" w:cs="Arial"/>
           <w:color w:val="auto"/>
           <w:kern w:val="2"/>
           <w:lang w:val="en-US" w:eastAsia="zh-CN" w:bidi="hi-IN"/>
         </w:rPr>
-        <w:t>Update Apps.cmd</w:t>
-      </w:r>
-    </w:p>
-    <w:p>
-      <w:pPr>
-        <w:pStyle w:val="Normal"/>
-        <w:bidi w:val="0"/>
-        <w:jc w:val="left"/>
-        <w:rPr/>
-      </w:pPr>
-      <w:r>
-        <w:rPr/>
-        <w:t>The purpose of this command prompt script is to launch the Update Apps.ps1 script in a PowerShell window with the proper administrative credentials needed to run unsigned PowerShell scripts in Windows.  When launched, it will prompt the user to click OK to elevate privileges, which is done on purpose, by design.  Otherwise, a fresh copy of Windows will not allow a new user to run unsigned PowerShell scripts by policy.</w:t>
+        <w:t>Update Apps.ps1</w:t>
+      </w:r>
+    </w:p>
+    <w:p>
+      <w:pPr>
+        <w:pStyle w:val="Normal"/>
+        <w:bidi w:val="0"/>
+        <w:jc w:val="left"/>
+        <w:rPr/>
+      </w:pPr>
+      <w:r>
+        <w:rPr/>
+        <w:t>The purpose of this script is to update all of the applications that KindWorks installed on the refurbished computer.  The value of this script is that, once launched, it updates multiple applications, saving the user significant time.  This relies on the Chocolately application to update the applications.</w:t>
       </w:r>
     </w:p>
     <w:p>
@@ -495,8 +492,8 @@
         <w:keepNext w:val="true"/>
         <w:widowControl/>
         <w:numPr>
-          <w:ilvl w:val="1"/>
-          <w:numId w:val="3"/>
+          <w:ilvl w:val="0"/>
+          <w:numId w:val="0"/>
         </w:numPr>
         <w:suppressAutoHyphens w:val="true"/>
         <w:bidi w:val="0"/>
@@ -547,7 +544,7 @@
         <w:pStyle w:val="Heading1"/>
         <w:numPr>
           <w:ilvl w:val="0"/>
-          <w:numId w:val="1"/>
+          <w:numId w:val="2"/>
         </w:numPr>
         <w:ind w:hanging="0" w:left="0"/>
         <w:rPr/>
@@ -577,99 +574,94 @@
       </w:pPr>
       <w:r>
         <w:rPr/>
-        <w:t>The following instructions should be followed after installing a fresh copy of Windows onto a KindWorks computer</w:t>
-      </w:r>
-    </w:p>
-    <w:p>
-      <w:pPr>
-        <w:pStyle w:val="Heading3"/>
-        <w:numPr>
-          <w:ilvl w:val="2"/>
-          <w:numId w:val="2"/>
-        </w:numPr>
-        <w:ind w:hanging="0" w:left="0"/>
-        <w:rPr/>
-      </w:pPr>
-      <w:r>
-        <w:rPr/>
-        <w:t>Installing Applications for the First Time</w:t>
-      </w:r>
-    </w:p>
-    <w:p>
-      <w:pPr>
-        <w:pStyle w:val="Normal"/>
-        <w:bidi w:val="0"/>
-        <w:jc w:val="left"/>
-        <w:rPr/>
-      </w:pPr>
-      <w:r>
-        <w:rPr/>
-      </w:r>
-    </w:p>
-    <w:p>
-      <w:pPr>
-        <w:pStyle w:val="Normal"/>
-        <w:numPr>
-          <w:ilvl w:val="0"/>
-          <w:numId w:val="4"/>
-        </w:numPr>
-        <w:bidi w:val="0"/>
-        <w:jc w:val="left"/>
-        <w:rPr/>
-      </w:pPr>
-      <w:r>
-        <w:rPr/>
-        <w:t xml:space="preserve">Copy the files listed above in the </w:t>
-      </w:r>
-      <w:hyperlink w:anchor="_toc26">
-        <w:r>
-          <w:rPr>
-            <w:rStyle w:val="Hyperlink"/>
-          </w:rPr>
-          <w:t xml:space="preserve">Brief Script Descriptions </w:t>
-        </w:r>
-      </w:hyperlink>
-      <w:r>
-        <w:rPr/>
-        <w:t>section onto an external drive and plug the drive into the computer you are refurbishing.</w:t>
-      </w:r>
-    </w:p>
-    <w:p>
-      <w:pPr>
-        <w:pStyle w:val="Normal"/>
-        <w:numPr>
-          <w:ilvl w:val="0"/>
-          <w:numId w:val="4"/>
-        </w:numPr>
-        <w:bidi w:val="0"/>
-        <w:jc w:val="left"/>
-        <w:rPr/>
-      </w:pPr>
-      <w:r>
-        <w:rPr/>
-        <w:t>From the external drive, run the “Initial File Copy Script.cmd” file and follow the prompts</w:t>
-      </w:r>
-    </w:p>
-    <w:p>
-      <w:pPr>
-        <w:pStyle w:val="Normal"/>
-        <w:numPr>
-          <w:ilvl w:val="1"/>
-          <w:numId w:val="13"/>
-        </w:numPr>
-        <w:bidi w:val="0"/>
-        <w:jc w:val="left"/>
+        <w:t xml:space="preserve">The following instructions should be followed after installing a fresh copy of Windows onto a KindWorks computer.  </w:t>
+      </w:r>
+      <w:r>
         <w:rPr>
           <w:b/>
           <w:bCs/>
         </w:rPr>
-      </w:pPr>
-      <w:r>
-        <w:rPr>
-          <w:b/>
-          <w:bCs/>
-        </w:rPr>
-        <w:t>If that script ran successfully, you can skip to step 5</w:t>
+        <w:t>Internet connectivity is required to proceed.</w:t>
+      </w:r>
+    </w:p>
+    <w:p>
+      <w:pPr>
+        <w:pStyle w:val="Heading3"/>
+        <w:numPr>
+          <w:ilvl w:val="2"/>
+          <w:numId w:val="3"/>
+        </w:numPr>
+        <w:ind w:hanging="0" w:left="0"/>
+        <w:rPr/>
+      </w:pPr>
+      <w:r>
+        <w:rPr/>
+      </w:r>
+    </w:p>
+    <w:p>
+      <w:pPr>
+        <w:pStyle w:val="Heading3"/>
+        <w:numPr>
+          <w:ilvl w:val="2"/>
+          <w:numId w:val="3"/>
+        </w:numPr>
+        <w:ind w:hanging="0" w:left="0"/>
+        <w:rPr/>
+      </w:pPr>
+      <w:r>
+        <w:rPr/>
+        <w:t xml:space="preserve">Installing Applications for the First Time </w:t>
+      </w:r>
+      <w:r>
+        <w:rPr/>
+        <w:t>on a Refurbished Windows Computer</w:t>
+      </w:r>
+    </w:p>
+    <w:p>
+      <w:pPr>
+        <w:pStyle w:val="Normal"/>
+        <w:bidi w:val="0"/>
+        <w:jc w:val="left"/>
+        <w:rPr/>
+      </w:pPr>
+      <w:r>
+        <w:rPr/>
+      </w:r>
+    </w:p>
+    <w:p>
+      <w:pPr>
+        <w:pStyle w:val="Normal"/>
+        <w:numPr>
+          <w:ilvl w:val="0"/>
+          <w:numId w:val="5"/>
+        </w:numPr>
+        <w:bidi w:val="0"/>
+        <w:jc w:val="left"/>
+        <w:rPr/>
+      </w:pPr>
+      <w:r>
+        <w:rPr/>
+        <w:t xml:space="preserve">Open </w:t>
+      </w:r>
+      <w:r>
+        <w:rPr/>
+        <w:t>PowerShell</w:t>
+      </w:r>
+    </w:p>
+    <w:p>
+      <w:pPr>
+        <w:pStyle w:val="Normal"/>
+        <w:numPr>
+          <w:ilvl w:val="0"/>
+          <w:numId w:val="5"/>
+        </w:numPr>
+        <w:bidi w:val="0"/>
+        <w:jc w:val="left"/>
+        <w:rPr/>
+      </w:pPr>
+      <w:r>
+        <w:rPr/>
+        <w:t>Run the following command (all on one line – be sure to type it in exactly right!)</w:t>
       </w:r>
     </w:p>
     <w:p>
@@ -680,44 +672,6 @@
           <w:numId w:val="0"/>
         </w:numPr>
         <w:bidi w:val="0"/>
-        <w:ind w:hanging="0" w:left="1080"/>
-        <w:jc w:val="left"/>
-        <w:rPr>
-          <w:b/>
-          <w:bCs/>
-        </w:rPr>
-      </w:pPr>
-      <w:r>
-        <w:rPr>
-          <w:b/>
-          <w:bCs/>
-        </w:rPr>
-      </w:r>
-    </w:p>
-    <w:p>
-      <w:pPr>
-        <w:pStyle w:val="Normal"/>
-        <w:numPr>
-          <w:ilvl w:val="0"/>
-          <w:numId w:val="4"/>
-        </w:numPr>
-        <w:bidi w:val="0"/>
-        <w:jc w:val="left"/>
-        <w:rPr/>
-      </w:pPr>
-      <w:r>
-        <w:rPr/>
-        <w:t>Create the following folder on the new KindWorks computer:</w:t>
-      </w:r>
-    </w:p>
-    <w:p>
-      <w:pPr>
-        <w:pStyle w:val="Normal"/>
-        <w:numPr>
-          <w:ilvl w:val="0"/>
-          <w:numId w:val="0"/>
-        </w:numPr>
-        <w:bidi w:val="0"/>
         <w:ind w:hanging="0" w:left="720"/>
         <w:jc w:val="left"/>
         <w:rPr/>
@@ -729,104 +683,330 @@
     <w:p>
       <w:pPr>
         <w:pStyle w:val="Normal"/>
-        <w:numPr>
-          <w:ilvl w:val="1"/>
-          <w:numId w:val="5"/>
-        </w:numPr>
-        <w:bidi w:val="0"/>
-        <w:jc w:val="left"/>
-        <w:rPr/>
-      </w:pPr>
-      <w:hyperlink r:id="rId2">
-        <w:r>
-          <w:rPr>
-            <w:rStyle w:val="Hyperlink"/>
-            <w:b/>
-            <w:bCs/>
-          </w:rPr>
-          <w:t>C:\KindWorksScripts</w:t>
-        </w:r>
-      </w:hyperlink>
-    </w:p>
-    <w:p>
-      <w:pPr>
-        <w:pStyle w:val="Normal"/>
-        <w:numPr>
-          <w:ilvl w:val="0"/>
-          <w:numId w:val="0"/>
-        </w:numPr>
-        <w:bidi w:val="0"/>
-        <w:ind w:hanging="0" w:left="1080"/>
-        <w:jc w:val="left"/>
-        <w:rPr>
-          <w:b/>
-          <w:bCs/>
-        </w:rPr>
-      </w:pPr>
-      <w:r>
-        <w:rPr>
-          <w:b/>
-          <w:bCs/>
-        </w:rPr>
-      </w:r>
-    </w:p>
-    <w:p>
-      <w:pPr>
-        <w:pStyle w:val="Normal"/>
-        <w:numPr>
-          <w:ilvl w:val="2"/>
-          <w:numId w:val="5"/>
-        </w:numPr>
-        <w:bidi w:val="0"/>
-        <w:jc w:val="left"/>
-        <w:rPr/>
-      </w:pPr>
-      <w:r>
-        <w:rPr/>
-        <w:t>Note that the reason we’re creating the folder directly off the C: drive is because it will avoid Windows permissions issues if the user decides to add another user to the computer in the future.</w:t>
-      </w:r>
-    </w:p>
-    <w:p>
-      <w:pPr>
-        <w:pStyle w:val="Normal"/>
-        <w:numPr>
-          <w:ilvl w:val="0"/>
-          <w:numId w:val="0"/>
-        </w:numPr>
-        <w:bidi w:val="0"/>
-        <w:ind w:hanging="0" w:left="720"/>
-        <w:jc w:val="left"/>
-        <w:rPr/>
-      </w:pPr>
-      <w:r>
-        <w:rPr/>
-      </w:r>
-    </w:p>
-    <w:p>
-      <w:pPr>
-        <w:pStyle w:val="Normal"/>
-        <w:numPr>
-          <w:ilvl w:val="0"/>
-          <w:numId w:val="4"/>
-        </w:numPr>
-        <w:bidi w:val="0"/>
-        <w:jc w:val="left"/>
-        <w:rPr/>
-      </w:pPr>
-      <w:r>
-        <w:rPr/>
-        <w:t>Copy the following files from the your external drive into the C</w:t>
+        <w:bidi w:val="0"/>
+        <w:ind w:hanging="0" w:left="709"/>
+        <w:jc w:val="left"/>
+        <w:rPr/>
+      </w:pPr>
+      <w:r>
+        <w:rPr>
+          <w:rFonts w:ascii="Lucida Console" w:hAnsi="Lucida Console"/>
+          <w:sz w:val="28"/>
+          <w:szCs w:val="28"/>
+        </w:rPr>
+        <w:t>curl.exe -L “</w:t>
       </w:r>
       <w:hyperlink r:id="rId3">
         <w:r>
           <w:rPr>
             <w:rStyle w:val="Hyperlink"/>
+            <w:rFonts w:ascii="Lucida Console" w:hAnsi="Lucida Console"/>
+            <w:sz w:val="28"/>
+            <w:szCs w:val="28"/>
+          </w:rPr>
+          <w:t>https://github.com/shimashi/kw-windows/archive/refs/heads/main.zip</w:t>
+        </w:r>
+      </w:hyperlink>
+      <w:r>
+        <w:rPr>
+          <w:rFonts w:ascii="Lucida Console" w:hAnsi="Lucida Console"/>
+          <w:sz w:val="28"/>
+          <w:szCs w:val="28"/>
+        </w:rPr>
+        <w:t>” -o “$env:USERPROFILE\Desktop\InstallScripts.zip”</w:t>
+      </w:r>
+    </w:p>
+    <w:p>
+      <w:pPr>
+        <w:pStyle w:val="Normal"/>
+        <w:numPr>
+          <w:ilvl w:val="0"/>
+          <w:numId w:val="0"/>
+        </w:numPr>
+        <w:bidi w:val="0"/>
+        <w:ind w:hanging="0" w:left="1080"/>
+        <w:jc w:val="left"/>
+        <w:rPr/>
+      </w:pPr>
+      <w:r>
+        <w:rPr/>
+      </w:r>
+    </w:p>
+    <w:p>
+      <w:pPr>
+        <w:pStyle w:val="Normal"/>
+        <w:numPr>
+          <w:ilvl w:val="0"/>
+          <w:numId w:val="5"/>
+        </w:numPr>
+        <w:bidi w:val="0"/>
+        <w:jc w:val="left"/>
+        <w:rPr/>
+      </w:pPr>
+      <w:r>
+        <w:rPr/>
+        <w:t xml:space="preserve">If the command is successful, you should see a file called </w:t>
+      </w:r>
+      <w:r>
+        <w:rPr>
+          <w:b/>
+          <w:bCs/>
+        </w:rPr>
+        <w:t>InstallScripts.Zip</w:t>
+      </w:r>
+      <w:r>
+        <w:rPr/>
+        <w:t xml:space="preserve"> appear on the Desktop.</w:t>
+      </w:r>
+    </w:p>
+    <w:p>
+      <w:pPr>
+        <w:pStyle w:val="Normal"/>
+        <w:numPr>
+          <w:ilvl w:val="0"/>
+          <w:numId w:val="5"/>
+        </w:numPr>
+        <w:bidi w:val="0"/>
+        <w:jc w:val="left"/>
+        <w:rPr/>
+      </w:pPr>
+      <w:r>
+        <w:rPr/>
+        <w:t xml:space="preserve">Double click the on the  </w:t>
+      </w:r>
+      <w:r>
+        <w:rPr>
+          <w:b/>
+          <w:bCs/>
+        </w:rPr>
+        <w:t xml:space="preserve">InstallScripts.Zip </w:t>
+      </w:r>
+      <w:r>
+        <w:rPr>
+          <w:b w:val="false"/>
+          <w:bCs w:val="false"/>
+        </w:rPr>
+        <w:t>file to open it up.</w:t>
+      </w:r>
+    </w:p>
+    <w:p>
+      <w:pPr>
+        <w:pStyle w:val="Normal"/>
+        <w:numPr>
+          <w:ilvl w:val="0"/>
+          <w:numId w:val="5"/>
+        </w:numPr>
+        <w:bidi w:val="0"/>
+        <w:jc w:val="left"/>
+        <w:rPr>
+          <w:b w:val="false"/>
+          <w:bCs w:val="false"/>
+        </w:rPr>
+      </w:pPr>
+      <w:r>
+        <w:rPr>
+          <w:b w:val="false"/>
+          <w:bCs w:val="false"/>
+        </w:rPr>
+        <w:t xml:space="preserve">Double click on the folder called </w:t>
+      </w:r>
+      <w:r>
+        <w:rPr>
+          <w:b/>
+          <w:bCs/>
+        </w:rPr>
+        <w:t xml:space="preserve">kw-windows-main </w:t>
+      </w:r>
+      <w:r>
+        <w:rPr>
+          <w:b w:val="false"/>
+          <w:bCs w:val="false"/>
+        </w:rPr>
+        <w:t>to open it up</w:t>
+      </w:r>
+    </w:p>
+    <w:p>
+      <w:pPr>
+        <w:pStyle w:val="Normal"/>
+        <w:numPr>
+          <w:ilvl w:val="0"/>
+          <w:numId w:val="5"/>
+        </w:numPr>
+        <w:bidi w:val="0"/>
+        <w:jc w:val="left"/>
+        <w:rPr>
+          <w:b w:val="false"/>
+          <w:bCs w:val="false"/>
+        </w:rPr>
+      </w:pPr>
+      <w:r>
+        <w:rPr>
+          <w:b w:val="false"/>
+          <w:bCs w:val="false"/>
+        </w:rPr>
+        <w:t xml:space="preserve">Copy the folder called </w:t>
+      </w:r>
+      <w:r>
+        <w:rPr>
+          <w:b/>
+          <w:bCs/>
+        </w:rPr>
+        <w:t>PowerShellScriptsAdam</w:t>
+      </w:r>
+      <w:r>
+        <w:rPr>
+          <w:b w:val="false"/>
+          <w:bCs w:val="false"/>
+        </w:rPr>
+        <w:t xml:space="preserve"> to the Desktop.  You can close Windows explorer now if you’d like.</w:t>
+      </w:r>
+    </w:p>
+    <w:p>
+      <w:pPr>
+        <w:pStyle w:val="Normal"/>
+        <w:numPr>
+          <w:ilvl w:val="0"/>
+          <w:numId w:val="5"/>
+        </w:numPr>
+        <w:bidi w:val="0"/>
+        <w:jc w:val="left"/>
+        <w:rPr/>
+      </w:pPr>
+      <w:r>
+        <w:rPr>
+          <w:b w:val="false"/>
+          <w:bCs w:val="false"/>
+        </w:rPr>
+        <w:t xml:space="preserve">Double click on the  </w:t>
+      </w:r>
+      <w:r>
+        <w:rPr>
+          <w:b/>
+          <w:bCs/>
+        </w:rPr>
+        <w:t xml:space="preserve">PowerShellScriptsAdam </w:t>
+      </w:r>
+      <w:r>
+        <w:rPr>
+          <w:b w:val="false"/>
+          <w:bCs w:val="false"/>
+        </w:rPr>
+        <w:t>folder on the Desktop to open it up</w:t>
+      </w:r>
+    </w:p>
+    <w:p>
+      <w:pPr>
+        <w:pStyle w:val="Normal"/>
+        <w:numPr>
+          <w:ilvl w:val="0"/>
+          <w:numId w:val="5"/>
+        </w:numPr>
+        <w:bidi w:val="0"/>
+        <w:jc w:val="left"/>
+        <w:rPr/>
+      </w:pPr>
+      <w:r>
+        <w:rPr/>
+        <w:t xml:space="preserve">Double click the </w:t>
+      </w:r>
+      <w:r>
+        <w:rPr>
+          <w:b/>
+          <w:bCs/>
+        </w:rPr>
+        <w:t xml:space="preserve">Bootup Bypass Script.cmd </w:t>
+      </w:r>
+      <w:r>
+        <w:rPr>
+          <w:b w:val="false"/>
+          <w:bCs w:val="false"/>
+        </w:rPr>
+        <w:t>file to run it.</w:t>
+      </w:r>
+    </w:p>
+    <w:p>
+      <w:pPr>
+        <w:pStyle w:val="Normal"/>
+        <w:numPr>
+          <w:ilvl w:val="0"/>
+          <w:numId w:val="0"/>
+        </w:numPr>
+        <w:bidi w:val="0"/>
+        <w:ind w:hanging="0" w:left="720"/>
+        <w:jc w:val="left"/>
+        <w:rPr>
+          <w:b w:val="false"/>
+          <w:bCs w:val="false"/>
+        </w:rPr>
+      </w:pPr>
+      <w:r>
+        <w:rPr>
+          <w:b w:val="false"/>
+          <w:bCs w:val="false"/>
+        </w:rPr>
+      </w:r>
+    </w:p>
+    <w:p>
+      <w:pPr>
+        <w:pStyle w:val="Normal"/>
+        <w:numPr>
+          <w:ilvl w:val="1"/>
+          <w:numId w:val="13"/>
+        </w:numPr>
+        <w:bidi w:val="0"/>
+        <w:jc w:val="left"/>
+        <w:rPr/>
+      </w:pPr>
+      <w:r>
+        <w:rPr>
+          <w:b w:val="false"/>
+          <w:bCs w:val="false"/>
+        </w:rPr>
+        <w:t>This</w:t>
+      </w:r>
+      <w:r>
+        <w:rPr>
+          <w:b w:val="false"/>
+          <w:bCs w:val="false"/>
+        </w:rPr>
+        <w:t xml:space="preserve"> script </w:t>
+      </w:r>
+      <w:r>
+        <w:rPr>
+          <w:b w:val="false"/>
+          <w:bCs w:val="false"/>
+        </w:rPr>
+        <w:t xml:space="preserve">copies </w:t>
+      </w:r>
+      <w:r>
+        <w:rPr>
+          <w:b w:val="false"/>
+          <w:bCs w:val="false"/>
+        </w:rPr>
+        <w:t xml:space="preserve">the </w:t>
+      </w:r>
+      <w:r>
+        <w:rPr>
+          <w:b w:val="false"/>
+          <w:bCs w:val="false"/>
+        </w:rPr>
+        <w:t>script files to the C</w:t>
+      </w:r>
+      <w:hyperlink r:id="rId4">
+        <w:r>
+          <w:rPr>
+            <w:rStyle w:val="Hyperlink"/>
+            <w:b w:val="false"/>
+            <w:bCs w:val="false"/>
           </w:rPr>
           <w:t>:\KindworksScripts</w:t>
         </w:r>
       </w:hyperlink>
       <w:r>
-        <w:rPr/>
+        <w:rPr>
+          <w:b w:val="false"/>
+          <w:bCs w:val="false"/>
+        </w:rPr>
         <w:t xml:space="preserve"> folder</w:t>
       </w:r>
     </w:p>
@@ -834,11 +1014,51 @@
       <w:pPr>
         <w:pStyle w:val="Normal"/>
         <w:numPr>
+          <w:ilvl w:val="2"/>
+          <w:numId w:val="13"/>
+        </w:numPr>
+        <w:bidi w:val="0"/>
+        <w:jc w:val="left"/>
+        <w:rPr/>
+      </w:pPr>
+      <w:r>
+        <w:rPr/>
+        <w:t xml:space="preserve">Note that the reason we’re </w:t>
+      </w:r>
+      <w:r>
+        <w:rPr/>
+        <w:t xml:space="preserve">copying files </w:t>
+      </w:r>
+      <w:r>
+        <w:rPr/>
+        <w:t xml:space="preserve">directly </w:t>
+      </w:r>
+      <w:r>
+        <w:rPr/>
+        <w:t xml:space="preserve">to </w:t>
+      </w:r>
+      <w:r>
+        <w:rPr/>
+        <w:t xml:space="preserve">the C: drive is because </w:t>
+      </w:r>
+      <w:r>
+        <w:rPr/>
+        <w:t xml:space="preserve">doing so </w:t>
+      </w:r>
+      <w:r>
+        <w:rPr/>
+        <w:t>will avoid Windows permissions issues if the user decides to add another user to the computer in the future.</w:t>
+      </w:r>
+    </w:p>
+    <w:p>
+      <w:pPr>
+        <w:pStyle w:val="Normal"/>
+        <w:numPr>
           <w:ilvl w:val="0"/>
           <w:numId w:val="0"/>
         </w:numPr>
         <w:bidi w:val="0"/>
-        <w:ind w:hanging="0" w:left="720"/>
+        <w:ind w:hanging="0" w:left="1440"/>
         <w:jc w:val="left"/>
         <w:rPr/>
       </w:pPr>
@@ -859,14 +1079,14 @@
       </w:pPr>
       <w:r>
         <w:rPr/>
-        <w:t>Bootup Bypass Script.cmd</w:t>
-      </w:r>
-    </w:p>
-    <w:p>
-      <w:pPr>
-        <w:pStyle w:val="Normal"/>
-        <w:numPr>
-          <w:ilvl w:val="1"/>
+        <w:t>You will see a Windows Command Prompt window appear</w:t>
+      </w:r>
+    </w:p>
+    <w:p>
+      <w:pPr>
+        <w:pStyle w:val="Normal"/>
+        <w:numPr>
+          <w:ilvl w:val="2"/>
           <w:numId w:val="6"/>
         </w:numPr>
         <w:bidi w:val="0"/>
@@ -875,250 +1095,7 @@
       </w:pPr>
       <w:r>
         <w:rPr/>
-        <w:t>Update Apps.cmd</w:t>
-      </w:r>
-    </w:p>
-    <w:p>
-      <w:pPr>
-        <w:pStyle w:val="Normal"/>
-        <w:numPr>
-          <w:ilvl w:val="1"/>
-          <w:numId w:val="6"/>
-        </w:numPr>
-        <w:bidi w:val="0"/>
-        <w:jc w:val="left"/>
-        <w:rPr/>
-      </w:pPr>
-      <w:r>
-        <w:rPr/>
-        <w:t>Initialize Script.ps1</w:t>
-      </w:r>
-    </w:p>
-    <w:p>
-      <w:pPr>
-        <w:pStyle w:val="Normal"/>
-        <w:numPr>
-          <w:ilvl w:val="1"/>
-          <w:numId w:val="6"/>
-        </w:numPr>
-        <w:bidi w:val="0"/>
-        <w:jc w:val="left"/>
-        <w:rPr/>
-      </w:pPr>
-      <w:r>
-        <w:rPr/>
-        <w:t>Update Apps.ps1</w:t>
-      </w:r>
-    </w:p>
-    <w:p>
-      <w:pPr>
-        <w:pStyle w:val="Normal"/>
-        <w:numPr>
-          <w:ilvl w:val="1"/>
-          <w:numId w:val="6"/>
-        </w:numPr>
-        <w:bidi w:val="0"/>
-        <w:jc w:val="left"/>
-        <w:rPr/>
-      </w:pPr>
-      <w:r>
-        <w:rPr/>
-        <w:t>KindWorks.pow</w:t>
-      </w:r>
-    </w:p>
-    <w:p>
-      <w:pPr>
-        <w:pStyle w:val="Normal"/>
-        <w:numPr>
-          <w:ilvl w:val="0"/>
-          <w:numId w:val="0"/>
-        </w:numPr>
-        <w:bidi w:val="0"/>
-        <w:ind w:hanging="0" w:left="1080"/>
-        <w:jc w:val="left"/>
-        <w:rPr/>
-      </w:pPr>
-      <w:r>
-        <w:rPr/>
-      </w:r>
-    </w:p>
-    <w:p>
-      <w:pPr>
-        <w:pStyle w:val="Normal"/>
-        <w:numPr>
-          <w:ilvl w:val="0"/>
-          <w:numId w:val="4"/>
-        </w:numPr>
-        <w:bidi w:val="0"/>
-        <w:jc w:val="left"/>
-        <w:rPr/>
-      </w:pPr>
-      <w:r>
-        <w:rPr/>
-        <w:t>Make sure that the KindWorks computer to be refurbished can access the Internet</w:t>
-      </w:r>
-    </w:p>
-    <w:p>
-      <w:pPr>
-        <w:pStyle w:val="Normal"/>
-        <w:numPr>
-          <w:ilvl w:val="0"/>
-          <w:numId w:val="0"/>
-        </w:numPr>
-        <w:bidi w:val="0"/>
-        <w:ind w:hanging="0" w:left="720"/>
-        <w:jc w:val="left"/>
-        <w:rPr/>
-      </w:pPr>
-      <w:r>
-        <w:rPr/>
-      </w:r>
-    </w:p>
-    <w:p>
-      <w:pPr>
-        <w:pStyle w:val="Normal"/>
-        <w:numPr>
-          <w:ilvl w:val="0"/>
-          <w:numId w:val="4"/>
-        </w:numPr>
-        <w:bidi w:val="0"/>
-        <w:jc w:val="left"/>
-        <w:rPr/>
-      </w:pPr>
-      <w:r>
-        <w:rPr/>
-        <w:t xml:space="preserve">Double click the </w:t>
-      </w:r>
-      <w:r>
-        <w:rPr>
-          <w:b/>
-          <w:bCs/>
-        </w:rPr>
-        <w:t xml:space="preserve">Bootup Bypass Script.cmd </w:t>
-      </w:r>
-      <w:r>
-        <w:rPr>
-          <w:b w:val="false"/>
-          <w:bCs w:val="false"/>
-        </w:rPr>
-        <w:t>file to run it.</w:t>
-      </w:r>
-    </w:p>
-    <w:p>
-      <w:pPr>
-        <w:pStyle w:val="Normal"/>
-        <w:numPr>
-          <w:ilvl w:val="0"/>
-          <w:numId w:val="0"/>
-        </w:numPr>
-        <w:bidi w:val="0"/>
-        <w:ind w:hanging="0" w:left="720"/>
-        <w:jc w:val="left"/>
-        <w:rPr>
-          <w:b w:val="false"/>
-          <w:bCs w:val="false"/>
-        </w:rPr>
-      </w:pPr>
-      <w:r>
-        <w:rPr>
-          <w:b w:val="false"/>
-          <w:bCs w:val="false"/>
-        </w:rPr>
-      </w:r>
-    </w:p>
-    <w:p>
-      <w:pPr>
-        <w:pStyle w:val="Normal"/>
-        <w:numPr>
-          <w:ilvl w:val="1"/>
-          <w:numId w:val="7"/>
-        </w:numPr>
-        <w:bidi w:val="0"/>
-        <w:jc w:val="left"/>
-        <w:rPr/>
-      </w:pPr>
-      <w:r>
-        <w:rPr/>
-        <w:t>You will see a Windows Command Prompt window appear</w:t>
-      </w:r>
-    </w:p>
-    <w:p>
-      <w:pPr>
-        <w:pStyle w:val="Normal"/>
-        <w:numPr>
-          <w:ilvl w:val="2"/>
-          <w:numId w:val="7"/>
-        </w:numPr>
-        <w:bidi w:val="0"/>
-        <w:jc w:val="left"/>
-        <w:rPr/>
-      </w:pPr>
-      <w:r>
-        <w:rPr/>
         <w:t xml:space="preserve">If you see a </w:t>
-      </w:r>
-      <w:r>
-        <w:rPr>
-          <w:i/>
-          <w:iCs/>
-        </w:rPr>
-        <w:t>User Account Control</w:t>
-      </w:r>
-      <w:r>
-        <w:rPr/>
-        <w:t xml:space="preserve"> window pop up, Click </w:t>
-      </w:r>
-      <w:r>
-        <w:rPr>
-          <w:b/>
-          <w:bCs/>
-        </w:rPr>
-        <w:t xml:space="preserve">Yes </w:t>
-      </w:r>
-      <w:r>
-        <w:rPr>
-          <w:b w:val="false"/>
-          <w:bCs w:val="false"/>
-        </w:rPr>
-        <w:t>to grant the computer permissions to elevate to administrative permissions.</w:t>
-      </w:r>
-    </w:p>
-    <w:p>
-      <w:pPr>
-        <w:pStyle w:val="Normal"/>
-        <w:numPr>
-          <w:ilvl w:val="0"/>
-          <w:numId w:val="0"/>
-        </w:numPr>
-        <w:bidi w:val="0"/>
-        <w:ind w:hanging="0" w:left="1440"/>
-        <w:jc w:val="left"/>
-        <w:rPr>
-          <w:b w:val="false"/>
-          <w:bCs w:val="false"/>
-        </w:rPr>
-      </w:pPr>
-      <w:r>
-        <w:rPr>
-          <w:b w:val="false"/>
-          <w:bCs w:val="false"/>
-        </w:rPr>
-      </w:r>
-    </w:p>
-    <w:p>
-      <w:pPr>
-        <w:pStyle w:val="Normal"/>
-        <w:numPr>
-          <w:ilvl w:val="1"/>
-          <w:numId w:val="7"/>
-        </w:numPr>
-        <w:bidi w:val="0"/>
-        <w:jc w:val="left"/>
-        <w:rPr/>
-      </w:pPr>
-      <w:r>
-        <w:rPr/>
-        <w:t xml:space="preserve">You will see the PowerShell script called </w:t>
       </w:r>
       <w:r>
         <w:rPr>
@@ -1127,22 +1104,91 @@
           <w:i/>
           <w:iCs/>
         </w:rPr>
-        <w:t>Initialize Script.ps1</w:t>
-      </w:r>
-      <w:r>
-        <w:rPr/>
-        <w:t xml:space="preserve"> run </w:t>
-      </w:r>
-      <w:r>
-        <w:rPr>
+        <w:t>User Account Control</w:t>
+      </w:r>
+      <w:r>
+        <w:rPr>
+          <w:b/>
+          <w:bCs/>
+        </w:rPr>
+        <w:t xml:space="preserve"> </w:t>
+      </w:r>
+      <w:r>
+        <w:rPr/>
+        <w:t xml:space="preserve">window pop up, Click </w:t>
+      </w:r>
+      <w:r>
+        <w:rPr>
+          <w:b/>
+          <w:bCs/>
+        </w:rPr>
+        <w:t xml:space="preserve">Yes </w:t>
+      </w:r>
+      <w:r>
+        <w:rPr>
+          <w:b w:val="false"/>
+          <w:bCs w:val="false"/>
+        </w:rPr>
+        <w:t>to grant the computer permissions to elevate to administrative permissions.</w:t>
+      </w:r>
+    </w:p>
+    <w:p>
+      <w:pPr>
+        <w:pStyle w:val="Normal"/>
+        <w:numPr>
+          <w:ilvl w:val="0"/>
+          <w:numId w:val="0"/>
+        </w:numPr>
+        <w:bidi w:val="0"/>
+        <w:ind w:hanging="0" w:left="1440"/>
+        <w:jc w:val="left"/>
+        <w:rPr>
+          <w:b w:val="false"/>
+          <w:bCs w:val="false"/>
+        </w:rPr>
+      </w:pPr>
+      <w:r>
+        <w:rPr>
+          <w:b w:val="false"/>
+          <w:bCs w:val="false"/>
+        </w:rPr>
+      </w:r>
+    </w:p>
+    <w:p>
+      <w:pPr>
+        <w:pStyle w:val="Normal"/>
+        <w:numPr>
+          <w:ilvl w:val="1"/>
+          <w:numId w:val="6"/>
+        </w:numPr>
+        <w:bidi w:val="0"/>
+        <w:jc w:val="left"/>
+        <w:rPr/>
+      </w:pPr>
+      <w:r>
+        <w:rPr/>
+        <w:t xml:space="preserve">You will see the PowerShell script called </w:t>
+      </w:r>
+      <w:r>
+        <w:rPr>
+          <w:b/>
+          <w:bCs/>
           <w:i/>
           <w:iCs/>
         </w:rPr>
-        <w:t xml:space="preserve">within </w:t>
-      </w:r>
-      <w:r>
-        <w:rPr/>
-        <w:t>the Windows Command Prompt window.</w:t>
+        <w:t>Initialize Script.ps1</w:t>
+      </w:r>
+      <w:r>
+        <w:rPr/>
+        <w:t xml:space="preserve"> run </w:t>
+      </w:r>
+      <w:r>
+        <w:rPr/>
+        <w:t>in a new PowerShell terminal</w:t>
+      </w:r>
+      <w:r>
+        <w:rPr/>
+        <w:t>.</w:t>
       </w:r>
     </w:p>
     <w:p>
@@ -1159,6 +1205,280 @@
       </w:pPr>
       <w:r>
         <w:rPr/>
+      </w:r>
+    </w:p>
+    <w:p>
+      <w:pPr>
+        <w:pStyle w:val="Normal"/>
+        <w:numPr>
+          <w:ilvl w:val="1"/>
+          <w:numId w:val="6"/>
+        </w:numPr>
+        <w:bidi w:val="0"/>
+        <w:jc w:val="left"/>
+        <w:rPr>
+          <w:b w:val="false"/>
+          <w:bCs w:val="false"/>
+        </w:rPr>
+      </w:pPr>
+      <w:r>
+        <w:rPr>
+          <w:b w:val="false"/>
+          <w:bCs w:val="false"/>
+        </w:rPr>
+        <w:t>The script will proceed with installing all of the standard apps that KindWorks typically installs on Windows machines.</w:t>
+      </w:r>
+    </w:p>
+    <w:p>
+      <w:pPr>
+        <w:pStyle w:val="Normal"/>
+        <w:numPr>
+          <w:ilvl w:val="0"/>
+          <w:numId w:val="0"/>
+        </w:numPr>
+        <w:bidi w:val="0"/>
+        <w:ind w:hanging="0" w:left="1080"/>
+        <w:jc w:val="left"/>
+        <w:rPr>
+          <w:b w:val="false"/>
+          <w:bCs w:val="false"/>
+        </w:rPr>
+      </w:pPr>
+      <w:r>
+        <w:rPr>
+          <w:b w:val="false"/>
+          <w:bCs w:val="false"/>
+        </w:rPr>
+      </w:r>
+    </w:p>
+    <w:p>
+      <w:pPr>
+        <w:pStyle w:val="Normal"/>
+        <w:numPr>
+          <w:ilvl w:val="1"/>
+          <w:numId w:val="6"/>
+        </w:numPr>
+        <w:bidi w:val="0"/>
+        <w:jc w:val="left"/>
+        <w:rPr>
+          <w:b w:val="false"/>
+          <w:bCs w:val="false"/>
+        </w:rPr>
+      </w:pPr>
+      <w:r>
+        <w:rPr>
+          <w:b w:val="false"/>
+          <w:bCs w:val="false"/>
+        </w:rPr>
+        <w:t>While the script is running, you may see a Windows Explorer window pop up. That is done on purpose, and you can safely close that file explorer window.</w:t>
+      </w:r>
+    </w:p>
+    <w:p>
+      <w:pPr>
+        <w:pStyle w:val="Normal"/>
+        <w:numPr>
+          <w:ilvl w:val="0"/>
+          <w:numId w:val="0"/>
+        </w:numPr>
+        <w:bidi w:val="0"/>
+        <w:ind w:hanging="0" w:left="1080"/>
+        <w:jc w:val="left"/>
+        <w:rPr>
+          <w:b w:val="false"/>
+          <w:bCs w:val="false"/>
+        </w:rPr>
+      </w:pPr>
+      <w:r>
+        <w:rPr>
+          <w:b w:val="false"/>
+          <w:bCs w:val="false"/>
+        </w:rPr>
+      </w:r>
+    </w:p>
+    <w:p>
+      <w:pPr>
+        <w:pStyle w:val="Normal"/>
+        <w:numPr>
+          <w:ilvl w:val="0"/>
+          <w:numId w:val="0"/>
+        </w:numPr>
+        <w:bidi w:val="0"/>
+        <w:ind w:hanging="0" w:left="1080"/>
+        <w:jc w:val="left"/>
+        <w:rPr/>
+      </w:pPr>
+      <w:r>
+        <w:rPr/>
+      </w:r>
+    </w:p>
+    <w:p>
+      <w:pPr>
+        <w:pStyle w:val="Normal"/>
+        <w:numPr>
+          <w:ilvl w:val="0"/>
+          <w:numId w:val="0"/>
+        </w:numPr>
+        <w:bidi w:val="0"/>
+        <w:ind w:hanging="0" w:left="720"/>
+        <w:jc w:val="left"/>
+        <w:rPr/>
+      </w:pPr>
+      <w:r>
+        <w:rPr/>
+      </w:r>
+    </w:p>
+    <w:p>
+      <w:pPr>
+        <w:pStyle w:val="Normal"/>
+        <w:numPr>
+          <w:ilvl w:val="0"/>
+          <w:numId w:val="5"/>
+        </w:numPr>
+        <w:bidi w:val="0"/>
+        <w:jc w:val="left"/>
+        <w:rPr/>
+      </w:pPr>
+      <w:r>
+        <w:rPr/>
+        <w:t xml:space="preserve">When the </w:t>
+      </w:r>
+      <w:r>
+        <w:rPr/>
+        <w:t xml:space="preserve">Command Prompt </w:t>
+      </w:r>
+      <w:r>
+        <w:rPr/>
+        <w:t>script completes, press any key on the keyboard to end the script and close the Windows Command Prompt</w:t>
+      </w:r>
+    </w:p>
+    <w:p>
+      <w:pPr>
+        <w:pStyle w:val="Normal"/>
+        <w:bidi w:val="0"/>
+        <w:jc w:val="left"/>
+        <w:rPr/>
+      </w:pPr>
+      <w:r>
+        <w:rPr/>
+      </w:r>
+    </w:p>
+    <w:p>
+      <w:pPr>
+        <w:pStyle w:val="Normal"/>
+        <w:bidi w:val="0"/>
+        <w:jc w:val="left"/>
+        <w:rPr/>
+      </w:pPr>
+      <w:r>
+        <w:rPr/>
+      </w:r>
+    </w:p>
+    <w:p>
+      <w:pPr>
+        <w:pStyle w:val="Normal"/>
+        <w:bidi w:val="0"/>
+        <w:jc w:val="left"/>
+        <w:rPr/>
+      </w:pPr>
+      <w:r>
+        <w:rPr/>
+      </w:r>
+    </w:p>
+    <w:p>
+      <w:pPr>
+        <w:pStyle w:val="Normal"/>
+        <w:bidi w:val="0"/>
+        <w:jc w:val="left"/>
+        <w:rPr/>
+      </w:pPr>
+      <w:r>
+        <w:rPr/>
+      </w:r>
+    </w:p>
+    <w:p>
+      <w:pPr>
+        <w:pStyle w:val="Heading3"/>
+        <w:numPr>
+          <w:ilvl w:val="2"/>
+          <w:numId w:val="3"/>
+        </w:numPr>
+        <w:ind w:hanging="0" w:left="0"/>
+        <w:rPr/>
+      </w:pPr>
+      <w:r>
+        <w:rPr/>
+        <w:t>Updating Applications</w:t>
+      </w:r>
+    </w:p>
+    <w:p>
+      <w:pPr>
+        <w:pStyle w:val="BodyText"/>
+        <w:ind w:hanging="0" w:left="0"/>
+        <w:rPr/>
+      </w:pPr>
+      <w:r>
+        <w:rPr/>
+        <w:t>Updating the multiple applications that were installed by KindWorks can be done by simply running the Update Apps script.  This saves the user time and many applications up to date.</w:t>
+      </w:r>
+    </w:p>
+    <w:p>
+      <w:pPr>
+        <w:pStyle w:val="BodyText"/>
+        <w:rPr/>
+      </w:pPr>
+      <w:r>
+        <w:rPr/>
+      </w:r>
+    </w:p>
+    <w:p>
+      <w:pPr>
+        <w:pStyle w:val="Normal"/>
+        <w:numPr>
+          <w:ilvl w:val="0"/>
+          <w:numId w:val="14"/>
+        </w:numPr>
+        <w:bidi w:val="0"/>
+        <w:jc w:val="left"/>
+        <w:rPr/>
+      </w:pPr>
+      <w:r>
+        <w:rPr>
+          <w:u w:val="none"/>
+        </w:rPr>
+        <w:t>On the Desktop, d</w:t>
+      </w:r>
+      <w:r>
+        <w:rPr/>
+        <w:t xml:space="preserve">ouble click the </w:t>
+      </w:r>
+      <w:r>
+        <w:rPr>
+          <w:b/>
+          <w:bCs/>
+        </w:rPr>
+        <w:t>Update Apps.cmd shortcut</w:t>
+      </w:r>
+    </w:p>
+    <w:p>
+      <w:pPr>
+        <w:pStyle w:val="Normal"/>
+        <w:numPr>
+          <w:ilvl w:val="0"/>
+          <w:numId w:val="0"/>
+        </w:numPr>
+        <w:bidi w:val="0"/>
+        <w:ind w:hanging="0" w:left="720"/>
+        <w:jc w:val="left"/>
+        <w:rPr>
+          <w:b/>
+          <w:bCs/>
+        </w:rPr>
+      </w:pPr>
+      <w:r>
+        <w:rPr>
+          <w:b/>
+          <w:bCs/>
+        </w:rPr>
       </w:r>
     </w:p>
     <w:p>
@@ -1180,7 +1500,7 @@
           <w:b w:val="false"/>
           <w:bCs w:val="false"/>
         </w:rPr>
-        <w:t>While the script is running, you may see a Windows Explorer window pop up. That is done on purpose, and you can safely close that file explorer window.</w:t>
+        <w:t xml:space="preserve">This shortcut should have been placed there by the Initialize Script. </w:t>
       </w:r>
     </w:p>
     <w:p>
@@ -1193,225 +1513,25 @@
         <w:bidi w:val="0"/>
         <w:ind w:hanging="0" w:left="1080"/>
         <w:jc w:val="left"/>
-        <w:rPr/>
-      </w:pPr>
-      <w:r>
-        <w:rPr/>
-      </w:r>
-    </w:p>
-    <w:p>
-      <w:pPr>
-        <w:pStyle w:val="Normal"/>
-        <w:numPr>
-          <w:ilvl w:val="0"/>
-          <w:numId w:val="0"/>
-        </w:numPr>
-        <w:bidi w:val="0"/>
-        <w:ind w:hanging="0" w:left="720"/>
-        <w:jc w:val="left"/>
-        <w:rPr/>
-      </w:pPr>
-      <w:r>
-        <w:rPr/>
-      </w:r>
-    </w:p>
-    <w:p>
-      <w:pPr>
-        <w:pStyle w:val="Normal"/>
-        <w:numPr>
-          <w:ilvl w:val="0"/>
-          <w:numId w:val="4"/>
-        </w:numPr>
-        <w:bidi w:val="0"/>
-        <w:jc w:val="left"/>
-        <w:rPr/>
-      </w:pPr>
-      <w:r>
-        <w:rPr/>
-        <w:t>When the script completes, press any key on the keyboard to end the script and close the Windows Command Prompt</w:t>
-      </w:r>
-    </w:p>
-    <w:p>
-      <w:pPr>
-        <w:pStyle w:val="Normal"/>
-        <w:bidi w:val="0"/>
-        <w:jc w:val="left"/>
-        <w:rPr/>
-      </w:pPr>
-      <w:r>
-        <w:rPr/>
-      </w:r>
-    </w:p>
-    <w:p>
-      <w:pPr>
-        <w:pStyle w:val="Normal"/>
-        <w:bidi w:val="0"/>
-        <w:jc w:val="left"/>
-        <w:rPr/>
-      </w:pPr>
-      <w:r>
-        <w:rPr/>
-      </w:r>
-    </w:p>
-    <w:p>
-      <w:pPr>
-        <w:pStyle w:val="Normal"/>
-        <w:bidi w:val="0"/>
-        <w:jc w:val="left"/>
-        <w:rPr/>
-      </w:pPr>
-      <w:r>
-        <w:rPr/>
-      </w:r>
-    </w:p>
-    <w:p>
-      <w:pPr>
-        <w:pStyle w:val="Normal"/>
-        <w:bidi w:val="0"/>
-        <w:jc w:val="left"/>
-        <w:rPr/>
-      </w:pPr>
-      <w:r>
-        <w:rPr/>
-      </w:r>
-    </w:p>
-    <w:p>
-      <w:pPr>
-        <w:pStyle w:val="Heading3"/>
+        <w:rPr>
+          <w:b w:val="false"/>
+          <w:bCs w:val="false"/>
+        </w:rPr>
+      </w:pPr>
+      <w:r>
+        <w:rPr>
+          <w:b w:val="false"/>
+          <w:bCs w:val="false"/>
+        </w:rPr>
+        <w:t xml:space="preserve"> </w:t>
+      </w:r>
+    </w:p>
+    <w:p>
+      <w:pPr>
+        <w:pStyle w:val="Normal"/>
         <w:numPr>
           <w:ilvl w:val="2"/>
-          <w:numId w:val="2"/>
-        </w:numPr>
-        <w:ind w:hanging="0" w:left="0"/>
-        <w:rPr/>
-      </w:pPr>
-      <w:r>
-        <w:rPr/>
-        <w:t>Updating Applications</w:t>
-      </w:r>
-    </w:p>
-    <w:p>
-      <w:pPr>
-        <w:pStyle w:val="BodyText"/>
-        <w:ind w:hanging="0" w:left="0"/>
-        <w:rPr/>
-      </w:pPr>
-      <w:r>
-        <w:rPr/>
-        <w:t>Updating the multiple applications that were installed by KindWorks can be done by simply running the Update Apps script.  This saves the user time and many applications up to date.</w:t>
-      </w:r>
-    </w:p>
-    <w:p>
-      <w:pPr>
-        <w:pStyle w:val="BodyText"/>
-        <w:rPr/>
-      </w:pPr>
-      <w:r>
-        <w:rPr/>
-      </w:r>
-    </w:p>
-    <w:p>
-      <w:pPr>
-        <w:pStyle w:val="Normal"/>
-        <w:numPr>
-          <w:ilvl w:val="0"/>
-          <w:numId w:val="16"/>
-        </w:numPr>
-        <w:bidi w:val="0"/>
-        <w:jc w:val="left"/>
-        <w:rPr/>
-      </w:pPr>
-      <w:r>
-        <w:rPr>
-          <w:u w:val="none"/>
-        </w:rPr>
-        <w:t>On the Desktop, d</w:t>
-      </w:r>
-      <w:r>
-        <w:rPr/>
-        <w:t xml:space="preserve">ouble click the </w:t>
-      </w:r>
-      <w:r>
-        <w:rPr>
-          <w:b/>
-          <w:bCs/>
-        </w:rPr>
-        <w:t>Update Apps.cmd shortcut</w:t>
-      </w:r>
-    </w:p>
-    <w:p>
-      <w:pPr>
-        <w:pStyle w:val="Normal"/>
-        <w:numPr>
-          <w:ilvl w:val="0"/>
-          <w:numId w:val="0"/>
-        </w:numPr>
-        <w:bidi w:val="0"/>
-        <w:ind w:hanging="0" w:left="720"/>
-        <w:jc w:val="left"/>
-        <w:rPr>
-          <w:b/>
-          <w:bCs/>
-        </w:rPr>
-      </w:pPr>
-      <w:r>
-        <w:rPr>
-          <w:b/>
-          <w:bCs/>
-        </w:rPr>
-      </w:r>
-    </w:p>
-    <w:p>
-      <w:pPr>
-        <w:pStyle w:val="Normal"/>
-        <w:numPr>
-          <w:ilvl w:val="1"/>
-          <w:numId w:val="8"/>
-        </w:numPr>
-        <w:bidi w:val="0"/>
-        <w:jc w:val="left"/>
-        <w:rPr>
-          <w:b w:val="false"/>
-          <w:bCs w:val="false"/>
-        </w:rPr>
-      </w:pPr>
-      <w:r>
-        <w:rPr>
-          <w:b w:val="false"/>
-          <w:bCs w:val="false"/>
-        </w:rPr>
-        <w:t xml:space="preserve">This shortcut should have been placed there by the Initialize Script. </w:t>
-      </w:r>
-    </w:p>
-    <w:p>
-      <w:pPr>
-        <w:pStyle w:val="Normal"/>
-        <w:numPr>
-          <w:ilvl w:val="0"/>
-          <w:numId w:val="0"/>
-        </w:numPr>
-        <w:bidi w:val="0"/>
-        <w:ind w:hanging="0" w:left="1080"/>
-        <w:jc w:val="left"/>
-        <w:rPr>
-          <w:b w:val="false"/>
-          <w:bCs w:val="false"/>
-        </w:rPr>
-      </w:pPr>
-      <w:r>
-        <w:rPr>
-          <w:b w:val="false"/>
-          <w:bCs w:val="false"/>
-        </w:rPr>
-        <w:t xml:space="preserve"> </w:t>
-      </w:r>
-    </w:p>
-    <w:p>
-      <w:pPr>
-        <w:pStyle w:val="Normal"/>
-        <w:numPr>
-          <w:ilvl w:val="2"/>
-          <w:numId w:val="8"/>
+          <w:numId w:val="7"/>
         </w:numPr>
         <w:bidi w:val="0"/>
         <w:jc w:val="left"/>
@@ -1427,7 +1547,7 @@
         </w:rPr>
         <w:t xml:space="preserve">If a shortcut to Update Apps is not located on the Desktop, either run the initialize App script, or go to </w:t>
       </w:r>
-      <w:hyperlink r:id="rId4">
+      <w:hyperlink r:id="rId5">
         <w:r>
           <w:rPr>
             <w:rStyle w:val="Hyperlink"/>
@@ -1472,7 +1592,7 @@
         <w:pStyle w:val="Normal"/>
         <w:numPr>
           <w:ilvl w:val="0"/>
-          <w:numId w:val="4"/>
+          <w:numId w:val="5"/>
         </w:numPr>
         <w:bidi w:val="0"/>
         <w:jc w:val="left"/>
@@ -1487,6 +1607,124 @@
           <w:bCs w:val="false"/>
         </w:rPr>
         <w:t>You will see a Windows Command Prompt window appear</w:t>
+      </w:r>
+    </w:p>
+    <w:p>
+      <w:pPr>
+        <w:pStyle w:val="Normal"/>
+        <w:numPr>
+          <w:ilvl w:val="0"/>
+          <w:numId w:val="0"/>
+        </w:numPr>
+        <w:bidi w:val="0"/>
+        <w:ind w:hanging="0" w:left="720"/>
+        <w:jc w:val="left"/>
+        <w:rPr>
+          <w:b w:val="false"/>
+          <w:bCs w:val="false"/>
+        </w:rPr>
+      </w:pPr>
+      <w:r>
+        <w:rPr>
+          <w:b w:val="false"/>
+          <w:bCs w:val="false"/>
+        </w:rPr>
+      </w:r>
+    </w:p>
+    <w:p>
+      <w:pPr>
+        <w:pStyle w:val="Normal"/>
+        <w:numPr>
+          <w:ilvl w:val="1"/>
+          <w:numId w:val="8"/>
+        </w:numPr>
+        <w:bidi w:val="0"/>
+        <w:jc w:val="left"/>
+        <w:rPr>
+          <w:b w:val="false"/>
+          <w:bCs w:val="false"/>
+        </w:rPr>
+      </w:pPr>
+      <w:r>
+        <w:rPr>
+          <w:b w:val="false"/>
+          <w:bCs w:val="false"/>
+        </w:rPr>
+        <w:t xml:space="preserve">If you see a User Account Control window pop up, Click </w:t>
+      </w:r>
+      <w:r>
+        <w:rPr>
+          <w:b/>
+          <w:bCs/>
+        </w:rPr>
+        <w:t>Yes</w:t>
+      </w:r>
+      <w:r>
+        <w:rPr>
+          <w:b w:val="false"/>
+          <w:bCs w:val="false"/>
+        </w:rPr>
+        <w:t xml:space="preserve"> to grant the computer permissions to elevate to administrative permissions.</w:t>
+      </w:r>
+    </w:p>
+    <w:p>
+      <w:pPr>
+        <w:pStyle w:val="Normal"/>
+        <w:numPr>
+          <w:ilvl w:val="0"/>
+          <w:numId w:val="0"/>
+        </w:numPr>
+        <w:bidi w:val="0"/>
+        <w:ind w:hanging="0" w:left="1080"/>
+        <w:jc w:val="left"/>
+        <w:rPr>
+          <w:b w:val="false"/>
+          <w:bCs w:val="false"/>
+        </w:rPr>
+      </w:pPr>
+      <w:r>
+        <w:rPr>
+          <w:b w:val="false"/>
+          <w:bCs w:val="false"/>
+        </w:rPr>
+      </w:r>
+    </w:p>
+    <w:p>
+      <w:pPr>
+        <w:pStyle w:val="Normal"/>
+        <w:numPr>
+          <w:ilvl w:val="0"/>
+          <w:numId w:val="5"/>
+        </w:numPr>
+        <w:bidi w:val="0"/>
+        <w:jc w:val="left"/>
+        <w:rPr>
+          <w:b w:val="false"/>
+          <w:bCs w:val="false"/>
+        </w:rPr>
+      </w:pPr>
+      <w:r>
+        <w:rPr>
+          <w:b w:val="false"/>
+          <w:bCs w:val="false"/>
+        </w:rPr>
+        <w:t xml:space="preserve">You will see the PowerShell script called Update Apps.ps1 run </w:t>
+      </w:r>
+      <w:r>
+        <w:rPr>
+          <w:b w:val="false"/>
+          <w:bCs w:val="false"/>
+          <w:i/>
+          <w:iCs/>
+        </w:rPr>
+        <w:t>separate</w:t>
+      </w:r>
+      <w:r>
+        <w:rPr>
+          <w:b w:val="false"/>
+          <w:bCs w:val="false"/>
+        </w:rPr>
+        <w:t xml:space="preserve"> from the Windows Command Prompt window.</w:t>
       </w:r>
     </w:p>
     <w:p>
@@ -1520,463 +1758,345 @@
         </w:numPr>
         <w:bidi w:val="0"/>
         <w:jc w:val="left"/>
-        <w:rPr>
-          <w:b w:val="false"/>
-          <w:bCs w:val="false"/>
-        </w:rPr>
-      </w:pPr>
-      <w:r>
-        <w:rPr>
-          <w:b w:val="false"/>
-          <w:bCs w:val="false"/>
-        </w:rPr>
-        <w:t xml:space="preserve">If you see a User Account Control window pop up, Click </w:t>
+        <w:rPr/>
+      </w:pPr>
+      <w:r>
+        <w:rPr>
+          <w:b w:val="false"/>
+          <w:bCs w:val="false"/>
+        </w:rPr>
+        <w:t>Note that the PowerShell window will appear small, but that is done on purpose so that the script will be visible no matter what size screen the script is being displayed on</w:t>
+      </w:r>
+    </w:p>
+    <w:p>
+      <w:pPr>
+        <w:pStyle w:val="Normal"/>
+        <w:numPr>
+          <w:ilvl w:val="0"/>
+          <w:numId w:val="0"/>
+        </w:numPr>
+        <w:bidi w:val="0"/>
+        <w:ind w:hanging="0" w:left="720"/>
+        <w:jc w:val="left"/>
+        <w:rPr>
+          <w:b w:val="false"/>
+          <w:bCs w:val="false"/>
+        </w:rPr>
+      </w:pPr>
+      <w:r>
+        <w:rPr>
+          <w:b w:val="false"/>
+          <w:bCs w:val="false"/>
+        </w:rPr>
+      </w:r>
+    </w:p>
+    <w:p>
+      <w:pPr>
+        <w:pStyle w:val="Normal"/>
+        <w:numPr>
+          <w:ilvl w:val="0"/>
+          <w:numId w:val="5"/>
+        </w:numPr>
+        <w:bidi w:val="0"/>
+        <w:jc w:val="left"/>
+        <w:rPr>
+          <w:b w:val="false"/>
+          <w:bCs w:val="false"/>
+        </w:rPr>
+      </w:pPr>
+      <w:r>
+        <w:rPr>
+          <w:b w:val="false"/>
+          <w:bCs w:val="false"/>
+        </w:rPr>
+        <w:t>Wait for the script to complete.  It may take several minutes.</w:t>
+      </w:r>
+    </w:p>
+    <w:p>
+      <w:pPr>
+        <w:pStyle w:val="Normal"/>
+        <w:numPr>
+          <w:ilvl w:val="0"/>
+          <w:numId w:val="0"/>
+        </w:numPr>
+        <w:bidi w:val="0"/>
+        <w:ind w:hanging="0" w:left="720"/>
+        <w:jc w:val="left"/>
+        <w:rPr>
+          <w:b w:val="false"/>
+          <w:bCs w:val="false"/>
+        </w:rPr>
+      </w:pPr>
+      <w:r>
+        <w:rPr>
+          <w:b w:val="false"/>
+          <w:bCs w:val="false"/>
+        </w:rPr>
+      </w:r>
+    </w:p>
+    <w:p>
+      <w:pPr>
+        <w:pStyle w:val="Normal"/>
+        <w:numPr>
+          <w:ilvl w:val="0"/>
+          <w:numId w:val="5"/>
+        </w:numPr>
+        <w:bidi w:val="0"/>
+        <w:jc w:val="left"/>
+        <w:rPr>
+          <w:b w:val="false"/>
+          <w:bCs w:val="false"/>
+        </w:rPr>
+      </w:pPr>
+      <w:r>
+        <w:rPr>
+          <w:b w:val="false"/>
+          <w:bCs w:val="false"/>
+        </w:rPr>
+        <w:t>When the script completes, press any key to close the PowerShell window.</w:t>
+      </w:r>
+    </w:p>
+    <w:p>
+      <w:pPr>
+        <w:pStyle w:val="Normal"/>
+        <w:bidi w:val="0"/>
+        <w:jc w:val="left"/>
+        <w:rPr>
+          <w:b w:val="false"/>
+          <w:bCs w:val="false"/>
+        </w:rPr>
+      </w:pPr>
+      <w:r>
+        <w:rPr>
+          <w:b w:val="false"/>
+          <w:bCs w:val="false"/>
+        </w:rPr>
+      </w:r>
+    </w:p>
+    <w:p>
+      <w:pPr>
+        <w:pStyle w:val="Normal"/>
+        <w:bidi w:val="0"/>
+        <w:jc w:val="left"/>
+        <w:rPr>
+          <w:b w:val="false"/>
+          <w:bCs w:val="false"/>
+        </w:rPr>
+      </w:pPr>
+      <w:r>
+        <w:rPr>
+          <w:b w:val="false"/>
+          <w:bCs w:val="false"/>
+        </w:rPr>
+      </w:r>
+    </w:p>
+    <w:p>
+      <w:pPr>
+        <w:pStyle w:val="Heading3"/>
+        <w:numPr>
+          <w:ilvl w:val="2"/>
+          <w:numId w:val="3"/>
+        </w:numPr>
+        <w:ind w:hanging="0" w:left="0"/>
+        <w:rPr/>
+      </w:pPr>
+      <w:r>
+        <w:rPr/>
+        <w:t>Follow On Actions</w:t>
+      </w:r>
+    </w:p>
+    <w:p>
+      <w:pPr>
+        <w:pStyle w:val="BodyText"/>
+        <w:ind w:hanging="0" w:left="0"/>
+        <w:rPr/>
+      </w:pPr>
+      <w:r>
+        <w:rPr/>
+        <w:t>The following steps still may need to be done manually.  These are things that should be investigated in the future to add to the scripts</w:t>
+      </w:r>
+    </w:p>
+    <w:p>
+      <w:pPr>
+        <w:pStyle w:val="BodyText"/>
+        <w:ind w:hanging="0" w:left="0"/>
+        <w:rPr/>
+      </w:pPr>
+      <w:r>
+        <w:rPr/>
+      </w:r>
+    </w:p>
+    <w:p>
+      <w:pPr>
+        <w:pStyle w:val="Heading"/>
+        <w:numPr>
+          <w:ilvl w:val="2"/>
+          <w:numId w:val="3"/>
+        </w:numPr>
+        <w:rPr/>
+      </w:pPr>
+      <w:r>
+        <w:rPr/>
+        <w:t>Choose the KindWorks power profile</w:t>
+      </w:r>
+    </w:p>
+    <w:p>
+      <w:pPr>
+        <w:pStyle w:val="BodyText"/>
+        <w:numPr>
+          <w:ilvl w:val="2"/>
+          <w:numId w:val="3"/>
+        </w:numPr>
+        <w:rPr/>
+      </w:pPr>
+      <w:r>
+        <w:rPr/>
+      </w:r>
+    </w:p>
+    <w:p>
+      <w:pPr>
+        <w:pStyle w:val="BodyText"/>
+        <w:numPr>
+          <w:ilvl w:val="0"/>
+          <w:numId w:val="10"/>
+        </w:numPr>
+        <w:rPr/>
+      </w:pPr>
+      <w:r>
+        <w:rPr/>
+        <w:t>Open Control Panel.  In Windows 11, go to the search bar and search for “</w:t>
       </w:r>
       <w:r>
         <w:rPr>
           <w:b/>
           <w:bCs/>
         </w:rPr>
-        <w:t>Yes</w:t>
-      </w:r>
-      <w:r>
-        <w:rPr>
-          <w:b w:val="false"/>
-          <w:bCs w:val="false"/>
-        </w:rPr>
-        <w:t xml:space="preserve"> to grant the computer permissions to elevate to administrative permissions.</w:t>
-      </w:r>
-    </w:p>
-    <w:p>
-      <w:pPr>
-        <w:pStyle w:val="Normal"/>
-        <w:numPr>
-          <w:ilvl w:val="0"/>
-          <w:numId w:val="0"/>
-        </w:numPr>
-        <w:bidi w:val="0"/>
-        <w:ind w:hanging="0" w:left="1080"/>
-        <w:jc w:val="left"/>
-        <w:rPr>
-          <w:b w:val="false"/>
-          <w:bCs w:val="false"/>
-        </w:rPr>
-      </w:pPr>
-      <w:r>
-        <w:rPr>
-          <w:b w:val="false"/>
-          <w:bCs w:val="false"/>
-        </w:rPr>
-      </w:r>
-    </w:p>
-    <w:p>
-      <w:pPr>
-        <w:pStyle w:val="Normal"/>
-        <w:numPr>
-          <w:ilvl w:val="0"/>
-          <w:numId w:val="4"/>
-        </w:numPr>
-        <w:bidi w:val="0"/>
-        <w:jc w:val="left"/>
-        <w:rPr>
-          <w:b w:val="false"/>
-          <w:bCs w:val="false"/>
-        </w:rPr>
-      </w:pPr>
-      <w:r>
-        <w:rPr>
-          <w:b w:val="false"/>
-          <w:bCs w:val="false"/>
-        </w:rPr>
-        <w:t xml:space="preserve">You will see the PowerShell script called Update Apps.ps1 run </w:t>
-      </w:r>
-      <w:r>
-        <w:rPr>
-          <w:b w:val="false"/>
-          <w:bCs w:val="false"/>
-          <w:i/>
-          <w:iCs/>
-        </w:rPr>
-        <w:t>separate</w:t>
-      </w:r>
-      <w:r>
-        <w:rPr>
-          <w:b w:val="false"/>
-          <w:bCs w:val="false"/>
-        </w:rPr>
-        <w:t xml:space="preserve"> from the Windows Command Prompt window.</w:t>
-      </w:r>
-    </w:p>
-    <w:p>
-      <w:pPr>
-        <w:pStyle w:val="Normal"/>
-        <w:numPr>
-          <w:ilvl w:val="0"/>
-          <w:numId w:val="0"/>
-        </w:numPr>
-        <w:bidi w:val="0"/>
-        <w:ind w:hanging="0" w:left="720"/>
-        <w:jc w:val="left"/>
-        <w:rPr>
-          <w:b w:val="false"/>
-          <w:bCs w:val="false"/>
-        </w:rPr>
-      </w:pPr>
-      <w:r>
-        <w:rPr>
-          <w:b w:val="false"/>
-          <w:bCs w:val="false"/>
-        </w:rPr>
-      </w:r>
-    </w:p>
-    <w:p>
-      <w:pPr>
-        <w:pStyle w:val="Normal"/>
+        <w:t>control panel</w:t>
+      </w:r>
+      <w:r>
+        <w:rPr/>
+        <w:t>”</w:t>
+      </w:r>
+    </w:p>
+    <w:p>
+      <w:pPr>
+        <w:pStyle w:val="BodyText"/>
+        <w:numPr>
+          <w:ilvl w:val="0"/>
+          <w:numId w:val="10"/>
+        </w:numPr>
+        <w:rPr/>
+      </w:pPr>
+      <w:r>
+        <w:rPr/>
+        <w:t>In control panel, select “</w:t>
+      </w:r>
+      <w:r>
+        <w:rPr>
+          <w:b/>
+          <w:bCs/>
+        </w:rPr>
+        <w:t>System and Security</w:t>
+      </w:r>
+      <w:r>
+        <w:rPr/>
+        <w:t>”</w:t>
+      </w:r>
+    </w:p>
+    <w:p>
+      <w:pPr>
+        <w:pStyle w:val="BodyText"/>
+        <w:numPr>
+          <w:ilvl w:val="0"/>
+          <w:numId w:val="10"/>
+        </w:numPr>
+        <w:rPr/>
+      </w:pPr>
+      <w:r>
+        <w:rPr/>
+        <w:t>In the System and Security Menu, click “</w:t>
+      </w:r>
+      <w:r>
+        <w:rPr>
+          <w:b/>
+          <w:bCs/>
+        </w:rPr>
+        <w:t>Power Options</w:t>
+      </w:r>
+      <w:r>
+        <w:rPr/>
+        <w:t>”</w:t>
+      </w:r>
+    </w:p>
+    <w:p>
+      <w:pPr>
+        <w:pStyle w:val="BodyText"/>
+        <w:numPr>
+          <w:ilvl w:val="0"/>
+          <w:numId w:val="10"/>
+        </w:numPr>
+        <w:rPr/>
+      </w:pPr>
+      <w:r>
+        <w:rPr/>
+        <w:t>In the Power Options screen, under “Plans shown on the battery meter” you should see one plan option selected, and that plan should be named “KindWorks”</w:t>
+      </w:r>
+    </w:p>
+    <w:p>
+      <w:pPr>
+        <w:pStyle w:val="BodyText"/>
+        <w:numPr>
+          <w:ilvl w:val="0"/>
+          <w:numId w:val="10"/>
+        </w:numPr>
+        <w:rPr/>
+      </w:pPr>
+      <w:r>
+        <w:rPr/>
+        <w:t>If you do not see the KindWorks plan, follow the next few steps</w:t>
+      </w:r>
+    </w:p>
+    <w:p>
+      <w:pPr>
+        <w:pStyle w:val="BodyText"/>
         <w:numPr>
           <w:ilvl w:val="1"/>
           <w:numId w:val="10"/>
         </w:numPr>
-        <w:bidi w:val="0"/>
-        <w:jc w:val="left"/>
-        <w:rPr/>
-      </w:pPr>
-      <w:r>
-        <w:rPr>
-          <w:b w:val="false"/>
-          <w:bCs w:val="false"/>
-        </w:rPr>
-        <w:t>Note that the PowerShell window will appear small, but that is done on purpose so that the script will be visible no matter what size screen the script is being displayed on</w:t>
-      </w:r>
-    </w:p>
-    <w:p>
-      <w:pPr>
-        <w:pStyle w:val="Normal"/>
-        <w:numPr>
-          <w:ilvl w:val="0"/>
-          <w:numId w:val="0"/>
-        </w:numPr>
-        <w:bidi w:val="0"/>
-        <w:ind w:hanging="0" w:left="720"/>
-        <w:jc w:val="left"/>
-        <w:rPr>
-          <w:b w:val="false"/>
-          <w:bCs w:val="false"/>
-        </w:rPr>
-      </w:pPr>
-      <w:r>
-        <w:rPr>
-          <w:b w:val="false"/>
-          <w:bCs w:val="false"/>
-        </w:rPr>
-      </w:r>
-    </w:p>
-    <w:p>
-      <w:pPr>
-        <w:pStyle w:val="Normal"/>
-        <w:numPr>
-          <w:ilvl w:val="0"/>
-          <w:numId w:val="4"/>
-        </w:numPr>
-        <w:bidi w:val="0"/>
-        <w:jc w:val="left"/>
-        <w:rPr>
-          <w:b w:val="false"/>
-          <w:bCs w:val="false"/>
-        </w:rPr>
-      </w:pPr>
-      <w:r>
-        <w:rPr>
-          <w:b w:val="false"/>
-          <w:bCs w:val="false"/>
-        </w:rPr>
-        <w:t>Wait for the script to complete.  It may take several minutes.</w:t>
-      </w:r>
-    </w:p>
-    <w:p>
-      <w:pPr>
-        <w:pStyle w:val="Normal"/>
-        <w:numPr>
-          <w:ilvl w:val="0"/>
-          <w:numId w:val="0"/>
-        </w:numPr>
-        <w:bidi w:val="0"/>
-        <w:ind w:hanging="0" w:left="720"/>
-        <w:jc w:val="left"/>
-        <w:rPr>
-          <w:b w:val="false"/>
-          <w:bCs w:val="false"/>
-        </w:rPr>
-      </w:pPr>
-      <w:r>
-        <w:rPr>
-          <w:b w:val="false"/>
-          <w:bCs w:val="false"/>
-        </w:rPr>
-      </w:r>
-    </w:p>
-    <w:p>
-      <w:pPr>
-        <w:pStyle w:val="Normal"/>
-        <w:numPr>
-          <w:ilvl w:val="0"/>
-          <w:numId w:val="4"/>
-        </w:numPr>
-        <w:bidi w:val="0"/>
-        <w:jc w:val="left"/>
-        <w:rPr>
-          <w:b w:val="false"/>
-          <w:bCs w:val="false"/>
-        </w:rPr>
-      </w:pPr>
-      <w:r>
-        <w:rPr>
-          <w:b w:val="false"/>
-          <w:bCs w:val="false"/>
-        </w:rPr>
-        <w:t>When the script completes, press any key to close the PowerShell window.</w:t>
-      </w:r>
-    </w:p>
-    <w:p>
-      <w:pPr>
-        <w:pStyle w:val="Normal"/>
-        <w:bidi w:val="0"/>
-        <w:jc w:val="left"/>
-        <w:rPr>
-          <w:b w:val="false"/>
-          <w:bCs w:val="false"/>
-        </w:rPr>
-      </w:pPr>
-      <w:r>
-        <w:rPr>
-          <w:b w:val="false"/>
-          <w:bCs w:val="false"/>
-        </w:rPr>
-      </w:r>
-    </w:p>
-    <w:p>
-      <w:pPr>
-        <w:pStyle w:val="Normal"/>
-        <w:bidi w:val="0"/>
-        <w:jc w:val="left"/>
-        <w:rPr>
-          <w:b w:val="false"/>
-          <w:bCs w:val="false"/>
-        </w:rPr>
-      </w:pPr>
-      <w:r>
-        <w:rPr>
-          <w:b w:val="false"/>
-          <w:bCs w:val="false"/>
-        </w:rPr>
-      </w:r>
-    </w:p>
-    <w:p>
-      <w:pPr>
-        <w:pStyle w:val="Heading3"/>
-        <w:numPr>
-          <w:ilvl w:val="2"/>
-          <w:numId w:val="2"/>
-        </w:numPr>
-        <w:ind w:hanging="0" w:left="0"/>
-        <w:rPr/>
-      </w:pPr>
-      <w:r>
-        <w:rPr/>
-        <w:t>Follow On Actions</w:t>
+        <w:rPr/>
+      </w:pPr>
+      <w:r>
+        <w:rPr/>
+        <w:t>Click the down arrow under “Show additional plans”</w:t>
       </w:r>
     </w:p>
     <w:p>
       <w:pPr>
         <w:pStyle w:val="BodyText"/>
-        <w:ind w:hanging="0" w:left="0"/>
-        <w:rPr/>
-      </w:pPr>
-      <w:r>
-        <w:rPr/>
-        <w:t>The following steps still may need to be done manually.  These are things that should be investigated in the future to add to the scripts</w:t>
-      </w:r>
-    </w:p>
-    <w:p>
-      <w:pPr>
-        <w:pStyle w:val="BodyText"/>
-        <w:ind w:hanging="0" w:left="0"/>
-        <w:rPr/>
-      </w:pPr>
-      <w:r>
-        <w:rPr/>
-      </w:r>
-    </w:p>
-    <w:p>
-      <w:pPr>
-        <w:pStyle w:val="Heading"/>
-        <w:numPr>
-          <w:ilvl w:val="2"/>
-          <w:numId w:val="2"/>
-        </w:numPr>
-        <w:rPr/>
-      </w:pPr>
-      <w:r>
-        <w:rPr/>
-        <w:t>Choose the KindWorks power profile</w:t>
-      </w:r>
-    </w:p>
-    <w:p>
-      <w:pPr>
-        <w:pStyle w:val="BodyText"/>
-        <w:numPr>
-          <w:ilvl w:val="2"/>
-          <w:numId w:val="2"/>
-        </w:numPr>
-        <w:rPr/>
-      </w:pPr>
-      <w:r>
-        <w:rPr/>
-      </w:r>
-    </w:p>
-    <w:p>
-      <w:pPr>
-        <w:pStyle w:val="BodyText"/>
-        <w:numPr>
-          <w:ilvl w:val="0"/>
-          <w:numId w:val="11"/>
-        </w:numPr>
-        <w:rPr/>
-      </w:pPr>
-      <w:r>
-        <w:rPr/>
-        <w:t>Open Control Panel.  In Windows 11, go to the search bar and search for “</w:t>
+        <w:numPr>
+          <w:ilvl w:val="1"/>
+          <w:numId w:val="10"/>
+        </w:numPr>
+        <w:rPr/>
+      </w:pPr>
+      <w:r>
+        <w:rPr/>
+        <w:t xml:space="preserve">Select a plan named </w:t>
       </w:r>
       <w:r>
         <w:rPr>
           <w:b/>
           <w:bCs/>
         </w:rPr>
-        <w:t>control panel</w:t>
-      </w:r>
-      <w:r>
-        <w:rPr/>
-        <w:t>”</w:t>
+        <w:t>KindWorks</w:t>
       </w:r>
     </w:p>
     <w:p>
       <w:pPr>
         <w:pStyle w:val="BodyText"/>
         <w:numPr>
-          <w:ilvl w:val="0"/>
-          <w:numId w:val="11"/>
-        </w:numPr>
-        <w:rPr/>
-      </w:pPr>
-      <w:r>
-        <w:rPr/>
-        <w:t>In control panel, select “</w:t>
-      </w:r>
-      <w:r>
-        <w:rPr>
-          <w:b/>
-          <w:bCs/>
-        </w:rPr>
-        <w:t>System and Security</w:t>
-      </w:r>
-      <w:r>
-        <w:rPr/>
-        <w:t>”</w:t>
-      </w:r>
-    </w:p>
-    <w:p>
-      <w:pPr>
-        <w:pStyle w:val="BodyText"/>
-        <w:numPr>
-          <w:ilvl w:val="0"/>
-          <w:numId w:val="11"/>
-        </w:numPr>
-        <w:rPr/>
-      </w:pPr>
-      <w:r>
-        <w:rPr/>
-        <w:t>In the System and Security Menu, click “</w:t>
-      </w:r>
-      <w:r>
-        <w:rPr>
-          <w:b/>
-          <w:bCs/>
-        </w:rPr>
-        <w:t>Power Options</w:t>
-      </w:r>
-      <w:r>
-        <w:rPr/>
-        <w:t>”</w:t>
-      </w:r>
-    </w:p>
-    <w:p>
-      <w:pPr>
-        <w:pStyle w:val="BodyText"/>
-        <w:numPr>
-          <w:ilvl w:val="0"/>
-          <w:numId w:val="11"/>
-        </w:numPr>
-        <w:rPr/>
-      </w:pPr>
-      <w:r>
-        <w:rPr/>
-        <w:t>In the Power Options screen, under “Plans shown on the battery meter” you should see one plan option selected, and that plan should be named “KindWorks”</w:t>
-      </w:r>
-    </w:p>
-    <w:p>
-      <w:pPr>
-        <w:pStyle w:val="BodyText"/>
-        <w:numPr>
-          <w:ilvl w:val="0"/>
-          <w:numId w:val="11"/>
-        </w:numPr>
-        <w:rPr/>
-      </w:pPr>
-      <w:r>
-        <w:rPr/>
-        <w:t>If you do not see the KindWorks plan, follow the next few steps</w:t>
-      </w:r>
-    </w:p>
-    <w:p>
-      <w:pPr>
-        <w:pStyle w:val="BodyText"/>
-        <w:numPr>
           <w:ilvl w:val="1"/>
-          <w:numId w:val="11"/>
-        </w:numPr>
-        <w:rPr/>
-      </w:pPr>
-      <w:r>
-        <w:rPr/>
-        <w:t>Click the down arrow under “Show additional plans”</w:t>
-      </w:r>
-    </w:p>
-    <w:p>
-      <w:pPr>
-        <w:pStyle w:val="BodyText"/>
-        <w:numPr>
-          <w:ilvl w:val="1"/>
-          <w:numId w:val="11"/>
-        </w:numPr>
-        <w:rPr/>
-      </w:pPr>
-      <w:r>
-        <w:rPr/>
-        <w:t xml:space="preserve">Select a plan named </w:t>
-      </w:r>
-      <w:r>
-        <w:rPr>
-          <w:b/>
-          <w:bCs/>
-        </w:rPr>
-        <w:t>KindWorks</w:t>
-      </w:r>
-    </w:p>
-    <w:p>
-      <w:pPr>
-        <w:pStyle w:val="BodyText"/>
-        <w:numPr>
-          <w:ilvl w:val="1"/>
-          <w:numId w:val="11"/>
+          <w:numId w:val="10"/>
         </w:numPr>
         <w:rPr/>
       </w:pPr>
@@ -2022,7 +2142,7 @@
                     </pic:cNvPicPr>
                   </pic:nvPicPr>
                   <pic:blipFill>
-                    <a:blip r:embed="rId5"/>
+                    <a:blip r:embed="rId6"/>
                     <a:srcRect l="-254" t="-587" r="-254" b="-587"/>
                     <a:stretch>
                       <a:fillRect/>
@@ -2050,7 +2170,7 @@
         <w:pStyle w:val="BodyText"/>
         <w:numPr>
           <w:ilvl w:val="1"/>
-          <w:numId w:val="2"/>
+          <w:numId w:val="3"/>
         </w:numPr>
         <w:rPr/>
       </w:pPr>
@@ -2135,7 +2255,7 @@
         <w:pStyle w:val="Heading"/>
         <w:numPr>
           <w:ilvl w:val="2"/>
-          <w:numId w:val="2"/>
+          <w:numId w:val="3"/>
         </w:numPr>
         <w:rPr/>
       </w:pPr>
@@ -2149,7 +2269,7 @@
         <w:pStyle w:val="BodyText"/>
         <w:numPr>
           <w:ilvl w:val="2"/>
-          <w:numId w:val="2"/>
+          <w:numId w:val="3"/>
         </w:numPr>
         <w:rPr/>
       </w:pPr>
@@ -2163,7 +2283,7 @@
         <w:pStyle w:val="BodyText"/>
         <w:numPr>
           <w:ilvl w:val="0"/>
-          <w:numId w:val="12"/>
+          <w:numId w:val="11"/>
         </w:numPr>
         <w:rPr/>
       </w:pPr>
@@ -2171,7 +2291,7 @@
         <w:rPr/>
         <w:t xml:space="preserve">Browse to this website:  </w:t>
       </w:r>
-      <w:hyperlink r:id="rId6">
+      <w:hyperlink r:id="rId7">
         <w:r>
           <w:rPr>
             <w:rStyle w:val="Hyperlink"/>
@@ -2185,7 +2305,7 @@
         <w:pStyle w:val="BodyText"/>
         <w:numPr>
           <w:ilvl w:val="0"/>
-          <w:numId w:val="12"/>
+          <w:numId w:val="11"/>
         </w:numPr>
         <w:rPr/>
       </w:pPr>
@@ -2199,7 +2319,7 @@
         <w:pStyle w:val="BodyText"/>
         <w:numPr>
           <w:ilvl w:val="0"/>
-          <w:numId w:val="12"/>
+          <w:numId w:val="11"/>
         </w:numPr>
         <w:spacing w:before="0" w:after="140"/>
         <w:rPr/>
@@ -2237,7 +2357,6 @@
         </w:tabs>
         <w:ind w:left="0" w:hanging="0"/>
       </w:pPr>
-      <w:rPr/>
     </w:lvl>
     <w:lvl w:ilvl="1">
       <w:start w:val="1"/>
@@ -2251,7 +2370,6 @@
         </w:tabs>
         <w:ind w:left="0" w:hanging="0"/>
       </w:pPr>
-      <w:rPr/>
     </w:lvl>
     <w:lvl w:ilvl="2">
       <w:start w:val="1"/>
@@ -2265,7 +2383,6 @@
         </w:tabs>
         <w:ind w:left="0" w:hanging="0"/>
       </w:pPr>
-      <w:rPr/>
     </w:lvl>
     <w:lvl w:ilvl="3">
       <w:start w:val="1"/>
@@ -2279,7 +2396,6 @@
         </w:tabs>
         <w:ind w:left="0" w:hanging="0"/>
       </w:pPr>
-      <w:rPr/>
     </w:lvl>
     <w:lvl w:ilvl="4">
       <w:start w:val="1"/>
@@ -2293,7 +2409,6 @@
         </w:tabs>
         <w:ind w:left="0" w:hanging="0"/>
       </w:pPr>
-      <w:rPr/>
     </w:lvl>
     <w:lvl w:ilvl="5">
       <w:start w:val="1"/>
@@ -2307,7 +2422,6 @@
         </w:tabs>
         <w:ind w:left="0" w:hanging="0"/>
       </w:pPr>
-      <w:rPr/>
     </w:lvl>
     <w:lvl w:ilvl="6">
       <w:start w:val="1"/>
@@ -2321,7 +2435,6 @@
         </w:tabs>
         <w:ind w:left="0" w:hanging="0"/>
       </w:pPr>
-      <w:rPr/>
     </w:lvl>
     <w:lvl w:ilvl="7">
       <w:start w:val="1"/>
@@ -2335,7 +2448,6 @@
         </w:tabs>
         <w:ind w:left="0" w:hanging="0"/>
       </w:pPr>
-      <w:rPr/>
     </w:lvl>
     <w:lvl w:ilvl="8">
       <w:start w:val="1"/>
@@ -2349,12 +2461,139 @@
         </w:tabs>
         <w:ind w:left="0" w:hanging="0"/>
       </w:pPr>
-      <w:rPr/>
     </w:lvl>
   </w:abstractNum>
   <w:abstractNum w:abstractNumId="2">
     <w:lvl w:ilvl="0">
       <w:start w:val="1"/>
+      <w:numFmt w:val="none"/>
+      <w:suff w:val="nothing"/>
+      <w:lvlText w:val=""/>
+      <w:lvlJc w:val="left"/>
+      <w:pPr>
+        <w:tabs>
+          <w:tab w:val="num" w:pos="0"/>
+        </w:tabs>
+        <w:ind w:left="0" w:hanging="0"/>
+      </w:pPr>
+      <w:rPr/>
+    </w:lvl>
+    <w:lvl w:ilvl="1">
+      <w:start w:val="1"/>
+      <w:numFmt w:val="none"/>
+      <w:suff w:val="nothing"/>
+      <w:lvlText w:val=""/>
+      <w:lvlJc w:val="left"/>
+      <w:pPr>
+        <w:tabs>
+          <w:tab w:val="num" w:pos="0"/>
+        </w:tabs>
+        <w:ind w:left="0" w:hanging="0"/>
+      </w:pPr>
+      <w:rPr/>
+    </w:lvl>
+    <w:lvl w:ilvl="2">
+      <w:start w:val="1"/>
+      <w:numFmt w:val="none"/>
+      <w:suff w:val="nothing"/>
+      <w:lvlText w:val=""/>
+      <w:lvlJc w:val="left"/>
+      <w:pPr>
+        <w:tabs>
+          <w:tab w:val="num" w:pos="0"/>
+        </w:tabs>
+        <w:ind w:left="0" w:hanging="0"/>
+      </w:pPr>
+      <w:rPr/>
+    </w:lvl>
+    <w:lvl w:ilvl="3">
+      <w:start w:val="1"/>
+      <w:numFmt w:val="none"/>
+      <w:suff w:val="nothing"/>
+      <w:lvlText w:val=""/>
+      <w:lvlJc w:val="left"/>
+      <w:pPr>
+        <w:tabs>
+          <w:tab w:val="num" w:pos="0"/>
+        </w:tabs>
+        <w:ind w:left="0" w:hanging="0"/>
+      </w:pPr>
+      <w:rPr/>
+    </w:lvl>
+    <w:lvl w:ilvl="4">
+      <w:start w:val="1"/>
+      <w:numFmt w:val="none"/>
+      <w:suff w:val="nothing"/>
+      <w:lvlText w:val=""/>
+      <w:lvlJc w:val="left"/>
+      <w:pPr>
+        <w:tabs>
+          <w:tab w:val="num" w:pos="0"/>
+        </w:tabs>
+        <w:ind w:left="0" w:hanging="0"/>
+      </w:pPr>
+      <w:rPr/>
+    </w:lvl>
+    <w:lvl w:ilvl="5">
+      <w:start w:val="1"/>
+      <w:numFmt w:val="none"/>
+      <w:suff w:val="nothing"/>
+      <w:lvlText w:val=""/>
+      <w:lvlJc w:val="left"/>
+      <w:pPr>
+        <w:tabs>
+          <w:tab w:val="num" w:pos="0"/>
+        </w:tabs>
+        <w:ind w:left="0" w:hanging="0"/>
+      </w:pPr>
+      <w:rPr/>
+    </w:lvl>
+    <w:lvl w:ilvl="6">
+      <w:start w:val="1"/>
+      <w:numFmt w:val="none"/>
+      <w:suff w:val="nothing"/>
+      <w:lvlText w:val=""/>
+      <w:lvlJc w:val="left"/>
+      <w:pPr>
+        <w:tabs>
+          <w:tab w:val="num" w:pos="0"/>
+        </w:tabs>
+        <w:ind w:left="0" w:hanging="0"/>
+      </w:pPr>
+      <w:rPr/>
+    </w:lvl>
+    <w:lvl w:ilvl="7">
+      <w:start w:val="1"/>
+      <w:numFmt w:val="none"/>
+      <w:suff w:val="nothing"/>
+      <w:lvlText w:val=""/>
+      <w:lvlJc w:val="left"/>
+      <w:pPr>
+        <w:tabs>
+          <w:tab w:val="num" w:pos="0"/>
+        </w:tabs>
+        <w:ind w:left="0" w:hanging="0"/>
+      </w:pPr>
+      <w:rPr/>
+    </w:lvl>
+    <w:lvl w:ilvl="8">
+      <w:start w:val="1"/>
+      <w:numFmt w:val="none"/>
+      <w:suff w:val="nothing"/>
+      <w:lvlText w:val=""/>
+      <w:lvlJc w:val="left"/>
+      <w:pPr>
+        <w:tabs>
+          <w:tab w:val="num" w:pos="0"/>
+        </w:tabs>
+        <w:ind w:left="0" w:hanging="0"/>
+      </w:pPr>
+      <w:rPr/>
+    </w:lvl>
+  </w:abstractNum>
+  <w:abstractNum w:abstractNumId="3">
+    <w:lvl w:ilvl="0">
+      <w:start w:val="1"/>
       <w:numFmt w:val="decimal"/>
       <w:suff w:val="nothing"/>
       <w:lvlText w:val="%1)"/>
@@ -2480,7 +2719,7 @@
       <w:rPr/>
     </w:lvl>
   </w:abstractNum>
-  <w:abstractNum w:abstractNumId="3">
+  <w:abstractNum w:abstractNumId="4">
     <w:lvl w:ilvl="0">
       <w:start w:val="1"/>
       <w:numFmt w:val="none"/>
@@ -2608,7 +2847,7 @@
       <w:rPr/>
     </w:lvl>
   </w:abstractNum>
-  <w:abstractNum w:abstractNumId="4">
+  <w:abstractNum w:abstractNumId="5">
     <w:lvl w:ilvl="0">
       <w:start w:val="1"/>
       <w:numFmt w:val="decimal"/>
@@ -2725,143 +2964,6 @@
         <w:ind w:left="3600" w:hanging="360"/>
       </w:pPr>
       <w:rPr/>
-    </w:lvl>
-  </w:abstractNum>
-  <w:abstractNum w:abstractNumId="5">
-    <w:lvl w:ilvl="0">
-      <w:start w:val="1"/>
-      <w:numFmt w:val="bullet"/>
-      <w:lvlText w:val=""/>
-      <w:lvlJc w:val="left"/>
-      <w:pPr>
-        <w:tabs>
-          <w:tab w:val="num" w:pos="720"/>
-        </w:tabs>
-        <w:ind w:left="720" w:hanging="360"/>
-      </w:pPr>
-      <w:rPr>
-        <w:rFonts w:ascii="Symbol" w:hAnsi="Symbol" w:cs="Symbol" w:hint="default"/>
-      </w:rPr>
-    </w:lvl>
-    <w:lvl w:ilvl="1">
-      <w:start w:val="1"/>
-      <w:numFmt w:val="bullet"/>
-      <w:lvlText w:val="◦"/>
-      <w:lvlJc w:val="left"/>
-      <w:pPr>
-        <w:tabs>
-          <w:tab w:val="num" w:pos="1080"/>
-        </w:tabs>
-        <w:ind w:left="1080" w:hanging="360"/>
-      </w:pPr>
-      <w:rPr>
-        <w:rFonts w:ascii="OpenSymbol" w:hAnsi="OpenSymbol" w:cs="OpenSymbol" w:hint="default"/>
-      </w:rPr>
-    </w:lvl>
-    <w:lvl w:ilvl="2">
-      <w:start w:val="1"/>
-      <w:numFmt w:val="bullet"/>
-      <w:lvlText w:val="▪"/>
-      <w:lvlJc w:val="left"/>
-      <w:pPr>
-        <w:tabs>
-          <w:tab w:val="num" w:pos="1440"/>
-        </w:tabs>
-        <w:ind w:left="1440" w:hanging="360"/>
-      </w:pPr>
-      <w:rPr>
-        <w:rFonts w:ascii="OpenSymbol" w:hAnsi="OpenSymbol" w:cs="OpenSymbol" w:hint="default"/>
-      </w:rPr>
-    </w:lvl>
-    <w:lvl w:ilvl="3">
-      <w:start w:val="1"/>
-      <w:numFmt w:val="bullet"/>
-      <w:lvlText w:val=""/>
-      <w:lvlJc w:val="left"/>
-      <w:pPr>
-        <w:tabs>
-          <w:tab w:val="num" w:pos="1800"/>
-        </w:tabs>
-        <w:ind w:left="1800" w:hanging="360"/>
-      </w:pPr>
-      <w:rPr>
-        <w:rFonts w:ascii="Symbol" w:hAnsi="Symbol" w:cs="Symbol" w:hint="default"/>
-      </w:rPr>
-    </w:lvl>
-    <w:lvl w:ilvl="4">
-      <w:start w:val="1"/>
-      <w:numFmt w:val="bullet"/>
-      <w:lvlText w:val="◦"/>
-      <w:lvlJc w:val="left"/>
-      <w:pPr>
-        <w:tabs>
-          <w:tab w:val="num" w:pos="2160"/>
-        </w:tabs>
-        <w:ind w:left="2160" w:hanging="360"/>
-      </w:pPr>
-      <w:rPr>
-        <w:rFonts w:ascii="OpenSymbol" w:hAnsi="OpenSymbol" w:cs="OpenSymbol" w:hint="default"/>
-      </w:rPr>
-    </w:lvl>
-    <w:lvl w:ilvl="5">
-      <w:start w:val="1"/>
-      <w:numFmt w:val="bullet"/>
-      <w:lvlText w:val="▪"/>
-      <w:lvlJc w:val="left"/>
-      <w:pPr>
-        <w:tabs>
-          <w:tab w:val="num" w:pos="2520"/>
-        </w:tabs>
-        <w:ind w:left="2520" w:hanging="360"/>
-      </w:pPr>
-      <w:rPr>
-        <w:rFonts w:ascii="OpenSymbol" w:hAnsi="OpenSymbol" w:cs="OpenSymbol" w:hint="default"/>
-      </w:rPr>
-    </w:lvl>
-    <w:lvl w:ilvl="6">
-      <w:start w:val="1"/>
-      <w:numFmt w:val="bullet"/>
-      <w:lvlText w:val=""/>
-      <w:lvlJc w:val="left"/>
-      <w:pPr>
-        <w:tabs>
-          <w:tab w:val="num" w:pos="2880"/>
-        </w:tabs>
-        <w:ind w:left="2880" w:hanging="360"/>
-      </w:pPr>
-      <w:rPr>
-        <w:rFonts w:ascii="Symbol" w:hAnsi="Symbol" w:cs="Symbol" w:hint="default"/>
-      </w:rPr>
-    </w:lvl>
-    <w:lvl w:ilvl="7">
-      <w:start w:val="1"/>
-      <w:numFmt w:val="bullet"/>
-      <w:lvlText w:val="◦"/>
-      <w:lvlJc w:val="left"/>
-      <w:pPr>
-        <w:tabs>
-          <w:tab w:val="num" w:pos="3240"/>
-        </w:tabs>
-        <w:ind w:left="3240" w:hanging="360"/>
-      </w:pPr>
-      <w:rPr>
-        <w:rFonts w:ascii="OpenSymbol" w:hAnsi="OpenSymbol" w:cs="OpenSymbol" w:hint="default"/>
-      </w:rPr>
-    </w:lvl>
-    <w:lvl w:ilvl="8">
-      <w:start w:val="1"/>
-      <w:numFmt w:val="bullet"/>
-      <w:lvlText w:val="▪"/>
-      <w:lvlJc w:val="left"/>
-      <w:pPr>
-        <w:tabs>
-          <w:tab w:val="num" w:pos="3600"/>
-        </w:tabs>
-        <w:ind w:left="3600" w:hanging="360"/>
-      </w:pPr>
-      <w:rPr>
-        <w:rFonts w:ascii="OpenSymbol" w:hAnsi="OpenSymbol" w:cs="OpenSymbol" w:hint="default"/>
-      </w:rPr>
     </w:lvl>
   </w:abstractNum>
   <w:abstractNum w:abstractNumId="6">
@@ -3415,8 +3517,8 @@
   <w:abstractNum w:abstractNumId="10">
     <w:lvl w:ilvl="0">
       <w:start w:val="1"/>
-      <w:numFmt w:val="bullet"/>
-      <w:lvlText w:val=""/>
+      <w:numFmt w:val="decimal"/>
+      <w:lvlText w:val="%1)"/>
       <w:lvlJc w:val="left"/>
       <w:pPr>
         <w:tabs>
@@ -3424,14 +3526,12 @@
         </w:tabs>
         <w:ind w:left="720" w:hanging="360"/>
       </w:pPr>
-      <w:rPr>
-        <w:rFonts w:ascii="Symbol" w:hAnsi="Symbol" w:cs="Symbol" w:hint="default"/>
-      </w:rPr>
+      <w:rPr/>
     </w:lvl>
     <w:lvl w:ilvl="1">
       <w:start w:val="1"/>
-      <w:numFmt w:val="bullet"/>
-      <w:lvlText w:val="◦"/>
+      <w:numFmt w:val="decimal"/>
+      <w:lvlText w:val="%2)"/>
       <w:lvlJc w:val="left"/>
       <w:pPr>
         <w:tabs>
@@ -3439,14 +3539,12 @@
         </w:tabs>
         <w:ind w:left="1080" w:hanging="360"/>
       </w:pPr>
-      <w:rPr>
-        <w:rFonts w:ascii="OpenSymbol" w:hAnsi="OpenSymbol" w:cs="OpenSymbol" w:hint="default"/>
-      </w:rPr>
+      <w:rPr/>
     </w:lvl>
     <w:lvl w:ilvl="2">
       <w:start w:val="1"/>
-      <w:numFmt w:val="bullet"/>
-      <w:lvlText w:val="▪"/>
+      <w:numFmt w:val="decimal"/>
+      <w:lvlText w:val="%3)"/>
       <w:lvlJc w:val="left"/>
       <w:pPr>
         <w:tabs>
@@ -3454,14 +3552,12 @@
         </w:tabs>
         <w:ind w:left="1440" w:hanging="360"/>
       </w:pPr>
-      <w:rPr>
-        <w:rFonts w:ascii="OpenSymbol" w:hAnsi="OpenSymbol" w:cs="OpenSymbol" w:hint="default"/>
-      </w:rPr>
+      <w:rPr/>
     </w:lvl>
     <w:lvl w:ilvl="3">
       <w:start w:val="1"/>
-      <w:numFmt w:val="bullet"/>
-      <w:lvlText w:val=""/>
+      <w:numFmt w:val="decimal"/>
+      <w:lvlText w:val="%4)"/>
       <w:lvlJc w:val="left"/>
       <w:pPr>
         <w:tabs>
@@ -3469,14 +3565,12 @@
         </w:tabs>
         <w:ind w:left="1800" w:hanging="360"/>
       </w:pPr>
-      <w:rPr>
-        <w:rFonts w:ascii="Symbol" w:hAnsi="Symbol" w:cs="Symbol" w:hint="default"/>
-      </w:rPr>
+      <w:rPr/>
     </w:lvl>
     <w:lvl w:ilvl="4">
       <w:start w:val="1"/>
-      <w:numFmt w:val="bullet"/>
-      <w:lvlText w:val="◦"/>
+      <w:numFmt w:val="decimal"/>
+      <w:lvlText w:val="%5)"/>
       <w:lvlJc w:val="left"/>
       <w:pPr>
         <w:tabs>
@@ -3484,14 +3578,12 @@
         </w:tabs>
         <w:ind w:left="2160" w:hanging="360"/>
       </w:pPr>
-      <w:rPr>
-        <w:rFonts w:ascii="OpenSymbol" w:hAnsi="OpenSymbol" w:cs="OpenSymbol" w:hint="default"/>
-      </w:rPr>
+      <w:rPr/>
     </w:lvl>
     <w:lvl w:ilvl="5">
       <w:start w:val="1"/>
-      <w:numFmt w:val="bullet"/>
-      <w:lvlText w:val="▪"/>
+      <w:numFmt w:val="decimal"/>
+      <w:lvlText w:val="%6)"/>
       <w:lvlJc w:val="left"/>
       <w:pPr>
         <w:tabs>
@@ -3499,14 +3591,12 @@
         </w:tabs>
         <w:ind w:left="2520" w:hanging="360"/>
       </w:pPr>
-      <w:rPr>
-        <w:rFonts w:ascii="OpenSymbol" w:hAnsi="OpenSymbol" w:cs="OpenSymbol" w:hint="default"/>
-      </w:rPr>
+      <w:rPr/>
     </w:lvl>
     <w:lvl w:ilvl="6">
       <w:start w:val="1"/>
-      <w:numFmt w:val="bullet"/>
-      <w:lvlText w:val=""/>
+      <w:numFmt w:val="decimal"/>
+      <w:lvlText w:val="%7)"/>
       <w:lvlJc w:val="left"/>
       <w:pPr>
         <w:tabs>
@@ -3514,14 +3604,12 @@
         </w:tabs>
         <w:ind w:left="2880" w:hanging="360"/>
       </w:pPr>
-      <w:rPr>
-        <w:rFonts w:ascii="Symbol" w:hAnsi="Symbol" w:cs="Symbol" w:hint="default"/>
-      </w:rPr>
+      <w:rPr/>
     </w:lvl>
     <w:lvl w:ilvl="7">
       <w:start w:val="1"/>
-      <w:numFmt w:val="bullet"/>
-      <w:lvlText w:val="◦"/>
+      <w:numFmt w:val="decimal"/>
+      <w:lvlText w:val="%8)"/>
       <w:lvlJc w:val="left"/>
       <w:pPr>
         <w:tabs>
@@ -3529,14 +3617,12 @@
         </w:tabs>
         <w:ind w:left="3240" w:hanging="360"/>
       </w:pPr>
-      <w:rPr>
-        <w:rFonts w:ascii="OpenSymbol" w:hAnsi="OpenSymbol" w:cs="OpenSymbol" w:hint="default"/>
-      </w:rPr>
+      <w:rPr/>
     </w:lvl>
     <w:lvl w:ilvl="8">
       <w:start w:val="1"/>
-      <w:numFmt w:val="bullet"/>
-      <w:lvlText w:val="▪"/>
+      <w:numFmt w:val="decimal"/>
+      <w:lvlText w:val="%9)"/>
       <w:lvlJc w:val="left"/>
       <w:pPr>
         <w:tabs>
@@ -3544,9 +3630,7 @@
         </w:tabs>
         <w:ind w:left="3600" w:hanging="360"/>
       </w:pPr>
-      <w:rPr>
-        <w:rFonts w:ascii="OpenSymbol" w:hAnsi="OpenSymbol" w:cs="OpenSymbol" w:hint="default"/>
-      </w:rPr>
+      <w:rPr/>
     </w:lvl>
   </w:abstractNum>
   <w:abstractNum w:abstractNumId="11">
@@ -3672,7 +3756,7 @@
     <w:lvl w:ilvl="0">
       <w:start w:val="1"/>
       <w:numFmt w:val="decimal"/>
-      <w:lvlText w:val="%1)"/>
+      <w:lvlText w:val="%1."/>
       <w:lvlJc w:val="left"/>
       <w:pPr>
         <w:tabs>
@@ -3685,7 +3769,7 @@
     <w:lvl w:ilvl="1">
       <w:start w:val="1"/>
       <w:numFmt w:val="decimal"/>
-      <w:lvlText w:val="%2)"/>
+      <w:lvlText w:val="%2."/>
       <w:lvlJc w:val="left"/>
       <w:pPr>
         <w:tabs>
@@ -3698,7 +3782,7 @@
     <w:lvl w:ilvl="2">
       <w:start w:val="1"/>
       <w:numFmt w:val="decimal"/>
-      <w:lvlText w:val="%3)"/>
+      <w:lvlText w:val="%3."/>
       <w:lvlJc w:val="left"/>
       <w:pPr>
         <w:tabs>
@@ -3711,7 +3795,7 @@
     <w:lvl w:ilvl="3">
       <w:start w:val="1"/>
       <w:numFmt w:val="decimal"/>
-      <w:lvlText w:val="%4)"/>
+      <w:lvlText w:val="%4."/>
       <w:lvlJc w:val="left"/>
       <w:pPr>
         <w:tabs>
@@ -3724,7 +3808,7 @@
     <w:lvl w:ilvl="4">
       <w:start w:val="1"/>
       <w:numFmt w:val="decimal"/>
-      <w:lvlText w:val="%5)"/>
+      <w:lvlText w:val="%5."/>
       <w:lvlJc w:val="left"/>
       <w:pPr>
         <w:tabs>
@@ -3737,7 +3821,7 @@
     <w:lvl w:ilvl="5">
       <w:start w:val="1"/>
       <w:numFmt w:val="decimal"/>
-      <w:lvlText w:val="%6)"/>
+      <w:lvlText w:val="%6."/>
       <w:lvlJc w:val="left"/>
       <w:pPr>
         <w:tabs>
@@ -3750,7 +3834,7 @@
     <w:lvl w:ilvl="6">
       <w:start w:val="1"/>
       <w:numFmt w:val="decimal"/>
-      <w:lvlText w:val="%7)"/>
+      <w:lvlText w:val="%7."/>
       <w:lvlJc w:val="left"/>
       <w:pPr>
         <w:tabs>
@@ -3763,7 +3847,7 @@
     <w:lvl w:ilvl="7">
       <w:start w:val="1"/>
       <w:numFmt w:val="decimal"/>
-      <w:lvlText w:val="%8)"/>
+      <w:lvlText w:val="%8."/>
       <w:lvlJc w:val="left"/>
       <w:pPr>
         <w:tabs>
@@ -3776,7 +3860,7 @@
     <w:lvl w:ilvl="8">
       <w:start w:val="1"/>
       <w:numFmt w:val="decimal"/>
-      <w:lvlText w:val="%9)"/>
+      <w:lvlText w:val="%9."/>
       <w:lvlJc w:val="left"/>
       <w:pPr>
         <w:tabs>
@@ -3922,244 +4006,6 @@
       <w:rPr>
         <w:rFonts w:ascii="OpenSymbol" w:hAnsi="OpenSymbol" w:cs="OpenSymbol" w:hint="default"/>
       </w:rPr>
-    </w:lvl>
-  </w:abstractNum>
-  <w:abstractNum w:abstractNumId="14">
-    <w:lvl w:ilvl="0">
-      <w:start w:val="1"/>
-      <w:numFmt w:val="decimal"/>
-      <w:lvlText w:val="%1."/>
-      <w:lvlJc w:val="left"/>
-      <w:pPr>
-        <w:tabs>
-          <w:tab w:val="num" w:pos="720"/>
-        </w:tabs>
-        <w:ind w:left="720" w:hanging="360"/>
-      </w:pPr>
-      <w:rPr/>
-    </w:lvl>
-    <w:lvl w:ilvl="1">
-      <w:start w:val="1"/>
-      <w:numFmt w:val="decimal"/>
-      <w:lvlText w:val="%2."/>
-      <w:lvlJc w:val="left"/>
-      <w:pPr>
-        <w:tabs>
-          <w:tab w:val="num" w:pos="1080"/>
-        </w:tabs>
-        <w:ind w:left="1080" w:hanging="360"/>
-      </w:pPr>
-      <w:rPr/>
-    </w:lvl>
-    <w:lvl w:ilvl="2">
-      <w:start w:val="1"/>
-      <w:numFmt w:val="decimal"/>
-      <w:lvlText w:val="%3."/>
-      <w:lvlJc w:val="left"/>
-      <w:pPr>
-        <w:tabs>
-          <w:tab w:val="num" w:pos="1440"/>
-        </w:tabs>
-        <w:ind w:left="1440" w:hanging="360"/>
-      </w:pPr>
-      <w:rPr/>
-    </w:lvl>
-    <w:lvl w:ilvl="3">
-      <w:start w:val="1"/>
-      <w:numFmt w:val="decimal"/>
-      <w:lvlText w:val="%4."/>
-      <w:lvlJc w:val="left"/>
-      <w:pPr>
-        <w:tabs>
-          <w:tab w:val="num" w:pos="1800"/>
-        </w:tabs>
-        <w:ind w:left="1800" w:hanging="360"/>
-      </w:pPr>
-      <w:rPr/>
-    </w:lvl>
-    <w:lvl w:ilvl="4">
-      <w:start w:val="1"/>
-      <w:numFmt w:val="decimal"/>
-      <w:lvlText w:val="%5."/>
-      <w:lvlJc w:val="left"/>
-      <w:pPr>
-        <w:tabs>
-          <w:tab w:val="num" w:pos="2160"/>
-        </w:tabs>
-        <w:ind w:left="2160" w:hanging="360"/>
-      </w:pPr>
-      <w:rPr/>
-    </w:lvl>
-    <w:lvl w:ilvl="5">
-      <w:start w:val="1"/>
-      <w:numFmt w:val="decimal"/>
-      <w:lvlText w:val="%6."/>
-      <w:lvlJc w:val="left"/>
-      <w:pPr>
-        <w:tabs>
-          <w:tab w:val="num" w:pos="2520"/>
-        </w:tabs>
-        <w:ind w:left="2520" w:hanging="360"/>
-      </w:pPr>
-      <w:rPr/>
-    </w:lvl>
-    <w:lvl w:ilvl="6">
-      <w:start w:val="1"/>
-      <w:numFmt w:val="decimal"/>
-      <w:lvlText w:val="%7."/>
-      <w:lvlJc w:val="left"/>
-      <w:pPr>
-        <w:tabs>
-          <w:tab w:val="num" w:pos="2880"/>
-        </w:tabs>
-        <w:ind w:left="2880" w:hanging="360"/>
-      </w:pPr>
-      <w:rPr/>
-    </w:lvl>
-    <w:lvl w:ilvl="7">
-      <w:start w:val="1"/>
-      <w:numFmt w:val="decimal"/>
-      <w:lvlText w:val="%8."/>
-      <w:lvlJc w:val="left"/>
-      <w:pPr>
-        <w:tabs>
-          <w:tab w:val="num" w:pos="3240"/>
-        </w:tabs>
-        <w:ind w:left="3240" w:hanging="360"/>
-      </w:pPr>
-      <w:rPr/>
-    </w:lvl>
-    <w:lvl w:ilvl="8">
-      <w:start w:val="1"/>
-      <w:numFmt w:val="decimal"/>
-      <w:lvlText w:val="%9."/>
-      <w:lvlJc w:val="left"/>
-      <w:pPr>
-        <w:tabs>
-          <w:tab w:val="num" w:pos="3600"/>
-        </w:tabs>
-        <w:ind w:left="3600" w:hanging="360"/>
-      </w:pPr>
-      <w:rPr/>
-    </w:lvl>
-  </w:abstractNum>
-  <w:abstractNum w:abstractNumId="15">
-    <w:lvl w:ilvl="0">
-      <w:start w:val="1"/>
-      <w:numFmt w:val="none"/>
-      <w:suff w:val="nothing"/>
-      <w:lvlText w:val=""/>
-      <w:lvlJc w:val="left"/>
-      <w:pPr>
-        <w:tabs>
-          <w:tab w:val="num" w:pos="0"/>
-        </w:tabs>
-        <w:ind w:left="0" w:hanging="0"/>
-      </w:pPr>
-    </w:lvl>
-    <w:lvl w:ilvl="1">
-      <w:start w:val="1"/>
-      <w:numFmt w:val="none"/>
-      <w:suff w:val="nothing"/>
-      <w:lvlText w:val=""/>
-      <w:lvlJc w:val="left"/>
-      <w:pPr>
-        <w:tabs>
-          <w:tab w:val="num" w:pos="0"/>
-        </w:tabs>
-        <w:ind w:left="0" w:hanging="0"/>
-      </w:pPr>
-    </w:lvl>
-    <w:lvl w:ilvl="2">
-      <w:start w:val="1"/>
-      <w:numFmt w:val="none"/>
-      <w:suff w:val="nothing"/>
-      <w:lvlText w:val=""/>
-      <w:lvlJc w:val="left"/>
-      <w:pPr>
-        <w:tabs>
-          <w:tab w:val="num" w:pos="0"/>
-        </w:tabs>
-        <w:ind w:left="0" w:hanging="0"/>
-      </w:pPr>
-    </w:lvl>
-    <w:lvl w:ilvl="3">
-      <w:start w:val="1"/>
-      <w:numFmt w:val="none"/>
-      <w:suff w:val="nothing"/>
-      <w:lvlText w:val=""/>
-      <w:lvlJc w:val="left"/>
-      <w:pPr>
-        <w:tabs>
-          <w:tab w:val="num" w:pos="0"/>
-        </w:tabs>
-        <w:ind w:left="0" w:hanging="0"/>
-      </w:pPr>
-    </w:lvl>
-    <w:lvl w:ilvl="4">
-      <w:start w:val="1"/>
-      <w:numFmt w:val="none"/>
-      <w:suff w:val="nothing"/>
-      <w:lvlText w:val=""/>
-      <w:lvlJc w:val="left"/>
-      <w:pPr>
-        <w:tabs>
-          <w:tab w:val="num" w:pos="0"/>
-        </w:tabs>
-        <w:ind w:left="0" w:hanging="0"/>
-      </w:pPr>
-    </w:lvl>
-    <w:lvl w:ilvl="5">
-      <w:start w:val="1"/>
-      <w:numFmt w:val="none"/>
-      <w:suff w:val="nothing"/>
-      <w:lvlText w:val=""/>
-      <w:lvlJc w:val="left"/>
-      <w:pPr>
-        <w:tabs>
-          <w:tab w:val="num" w:pos="0"/>
-        </w:tabs>
-        <w:ind w:left="0" w:hanging="0"/>
-      </w:pPr>
-    </w:lvl>
-    <w:lvl w:ilvl="6">
-      <w:start w:val="1"/>
-      <w:numFmt w:val="none"/>
-      <w:suff w:val="nothing"/>
-      <w:lvlText w:val=""/>
-      <w:lvlJc w:val="left"/>
-      <w:pPr>
-        <w:tabs>
-          <w:tab w:val="num" w:pos="0"/>
-        </w:tabs>
-        <w:ind w:left="0" w:hanging="0"/>
-      </w:pPr>
-    </w:lvl>
-    <w:lvl w:ilvl="7">
-      <w:start w:val="1"/>
-      <w:numFmt w:val="none"/>
-      <w:suff w:val="nothing"/>
-      <w:lvlText w:val=""/>
-      <w:lvlJc w:val="left"/>
-      <w:pPr>
-        <w:tabs>
-          <w:tab w:val="num" w:pos="0"/>
-        </w:tabs>
-        <w:ind w:left="0" w:hanging="0"/>
-      </w:pPr>
-    </w:lvl>
-    <w:lvl w:ilvl="8">
-      <w:start w:val="1"/>
-      <w:numFmt w:val="none"/>
-      <w:suff w:val="nothing"/>
-      <w:lvlText w:val=""/>
-      <w:lvlJc w:val="left"/>
-      <w:pPr>
-        <w:tabs>
-          <w:tab w:val="num" w:pos="0"/>
-        </w:tabs>
-        <w:ind w:left="0" w:hanging="0"/>
-      </w:pPr>
     </w:lvl>
   </w:abstractNum>
   <w:num w:numId="1">
@@ -4202,13 +4048,7 @@
     <w:abstractNumId w:val="13"/>
   </w:num>
   <w:num w:numId="14">
-    <w:abstractNumId w:val="14"/>
-  </w:num>
-  <w:num w:numId="15">
-    <w:abstractNumId w:val="15"/>
-  </w:num>
-  <w:num w:numId="16">
-    <w:abstractNumId w:val="4"/>
+    <w:abstractNumId w:val="5"/>
     <w:lvlOverride w:ilvl="0">
       <w:startOverride w:val="1"/>
     </w:lvlOverride>
@@ -4261,7 +4101,7 @@
     <w:pPr>
       <w:numPr>
         <w:ilvl w:val="0"/>
-        <w:numId w:val="1"/>
+        <w:numId w:val="2"/>
       </w:numPr>
       <w:spacing w:before="240" w:after="120"/>
       <w:outlineLvl w:val="0"/>
@@ -4281,7 +4121,7 @@
     <w:pPr>
       <w:numPr>
         <w:ilvl w:val="1"/>
-        <w:numId w:val="3"/>
+        <w:numId w:val="4"/>
       </w:numPr>
       <w:spacing w:before="200" w:after="120"/>
       <w:outlineLvl w:val="1"/>
@@ -4301,7 +4141,7 @@
     <w:pPr>
       <w:numPr>
         <w:ilvl w:val="2"/>
-        <w:numId w:val="2"/>
+        <w:numId w:val="3"/>
       </w:numPr>
       <w:spacing w:before="140" w:after="120"/>
       <w:outlineLvl w:val="2"/>
@@ -4430,37 +4270,37 @@
         <a:srgbClr val="000000"/>
       </a:dk1>
       <a:lt1>
-        <a:srgbClr val="FFFFFF"/>
+        <a:srgbClr val="ffffff"/>
       </a:lt1>
       <a:dk2>
         <a:srgbClr val="000000"/>
       </a:dk2>
       <a:lt2>
-        <a:srgbClr val="FFFFFF"/>
+        <a:srgbClr val="ffffff"/>
       </a:lt2>
       <a:accent1>
-        <a:srgbClr val="18A303"/>
+        <a:srgbClr val="18a303"/>
       </a:accent1>
       <a:accent2>
-        <a:srgbClr val="0369A3"/>
+        <a:srgbClr val="0369a3"/>
       </a:accent2>
       <a:accent3>
-        <a:srgbClr val="A33E03"/>
+        <a:srgbClr val="a33e03"/>
       </a:accent3>
       <a:accent4>
-        <a:srgbClr val="8E03A3"/>
+        <a:srgbClr val="8e03a3"/>
       </a:accent4>
       <a:accent5>
-        <a:srgbClr val="C99C00"/>
+        <a:srgbClr val="c99c00"/>
       </a:accent5>
       <a:accent6>
-        <a:srgbClr val="C9211E"/>
+        <a:srgbClr val="c9211e"/>
       </a:accent6>
       <a:hlink>
-        <a:srgbClr val="0000EE"/>
+        <a:srgbClr val="0000ee"/>
       </a:hlink>
       <a:folHlink>
-        <a:srgbClr val="551A8B"/>
+        <a:srgbClr val="551a8b"/>
       </a:folHlink>
     </a:clrScheme>
     <a:fontScheme name="Office">

</xml_diff>